<commit_message>
2 verschillende itteratie's voor de opdrachtgever en de stresstest
</commit_message>
<xml_diff>
--- a/n8n/dashboard/versiedocumentatie.docx
+++ b/n8n/dashboard/versiedocumentatie.docx
@@ -445,10 +445,10 @@
         </w:tblBorders>
       </w:tblPr>
       <w:tblGrid>
-        <w:gridCol w:w="1100"/>
-        <w:gridCol w:w="2600"/>
-        <w:gridCol w:w="2830"/>
-        <w:gridCol w:w="2830"/>
+        <w:gridCol w:w="900"/>
+        <w:gridCol w:w="2500"/>
+        <w:gridCol w:w="3000"/>
+        <w:gridCol w:w="2960"/>
       </w:tblGrid>
       <w:tr>
         <w:trPr>
@@ -456,7 +456,7 @@
         </w:trPr>
         <w:tc>
           <w:tcPr>
-            <w:tcW w:type="dxa" w:w="1100"/>
+            <w:tcW w:type="dxa" w:w="900"/>
             <w:tcBorders>
               <w:top w:val="single" w:color="CCCCCC" w:sz="1"/>
               <w:left w:val="single" w:color="CCCCCC" w:sz="1"/>
@@ -484,7 +484,7 @@
         </w:tc>
         <w:tc>
           <w:tcPr>
-            <w:tcW w:type="dxa" w:w="2600"/>
+            <w:tcW w:type="dxa" w:w="2500"/>
             <w:tcBorders>
               <w:top w:val="single" w:color="CCCCCC" w:sz="1"/>
               <w:left w:val="single" w:color="CCCCCC" w:sz="1"/>
@@ -512,7 +512,7 @@
         </w:tc>
         <w:tc>
           <w:tcPr>
-            <w:tcW w:type="dxa" w:w="2830"/>
+            <w:tcW w:type="dxa" w:w="3000"/>
             <w:tcBorders>
               <w:top w:val="single" w:color="CCCCCC" w:sz="1"/>
               <w:left w:val="single" w:color="CCCCCC" w:sz="1"/>
@@ -540,7 +540,7 @@
         </w:tc>
         <w:tc>
           <w:tcPr>
-            <w:tcW w:type="dxa" w:w="2830"/>
+            <w:tcW w:type="dxa" w:w="2960"/>
             <w:tcBorders>
               <w:top w:val="single" w:color="CCCCCC" w:sz="1"/>
               <w:left w:val="single" w:color="CCCCCC" w:sz="1"/>
@@ -570,7 +570,7 @@
       <w:tr>
         <w:tc>
           <w:tcPr>
-            <w:tcW w:type="dxa" w:w="1100"/>
+            <w:tcW w:type="dxa" w:w="900"/>
             <w:tcBorders>
               <w:top w:val="single" w:color="CCCCCC" w:sz="1"/>
               <w:left w:val="single" w:color="CCCCCC" w:sz="1"/>
@@ -593,7 +593,7 @@
         </w:tc>
         <w:tc>
           <w:tcPr>
-            <w:tcW w:type="dxa" w:w="2600"/>
+            <w:tcW w:type="dxa" w:w="2500"/>
             <w:tcBorders>
               <w:top w:val="single" w:color="CCCCCC" w:sz="1"/>
               <w:left w:val="single" w:color="CCCCCC" w:sz="1"/>
@@ -616,7 +616,7 @@
         </w:tc>
         <w:tc>
           <w:tcPr>
-            <w:tcW w:type="dxa" w:w="2830"/>
+            <w:tcW w:type="dxa" w:w="3000"/>
             <w:tcBorders>
               <w:top w:val="single" w:color="CCCCCC" w:sz="1"/>
               <w:left w:val="single" w:color="CCCCCC" w:sz="1"/>
@@ -639,7 +639,7 @@
         </w:tc>
         <w:tc>
           <w:tcPr>
-            <w:tcW w:type="dxa" w:w="2830"/>
+            <w:tcW w:type="dxa" w:w="2960"/>
             <w:tcBorders>
               <w:top w:val="single" w:color="CCCCCC" w:sz="1"/>
               <w:left w:val="single" w:color="CCCCCC" w:sz="1"/>
@@ -664,7 +664,7 @@
       <w:tr>
         <w:tc>
           <w:tcPr>
-            <w:tcW w:type="dxa" w:w="1100"/>
+            <w:tcW w:type="dxa" w:w="900"/>
             <w:tcBorders>
               <w:top w:val="single" w:color="CCCCCC" w:sz="1"/>
               <w:left w:val="single" w:color="CCCCCC" w:sz="1"/>
@@ -686,7 +686,7 @@
         </w:tc>
         <w:tc>
           <w:tcPr>
-            <w:tcW w:type="dxa" w:w="2600"/>
+            <w:tcW w:type="dxa" w:w="2500"/>
             <w:tcBorders>
               <w:top w:val="single" w:color="CCCCCC" w:sz="1"/>
               <w:left w:val="single" w:color="CCCCCC" w:sz="1"/>
@@ -708,7 +708,7 @@
         </w:tc>
         <w:tc>
           <w:tcPr>
-            <w:tcW w:type="dxa" w:w="2830"/>
+            <w:tcW w:type="dxa" w:w="3000"/>
             <w:tcBorders>
               <w:top w:val="single" w:color="CCCCCC" w:sz="1"/>
               <w:left w:val="single" w:color="CCCCCC" w:sz="1"/>
@@ -730,7 +730,7 @@
         </w:tc>
         <w:tc>
           <w:tcPr>
-            <w:tcW w:type="dxa" w:w="2830"/>
+            <w:tcW w:type="dxa" w:w="2960"/>
             <w:tcBorders>
               <w:top w:val="single" w:color="CCCCCC" w:sz="1"/>
               <w:left w:val="single" w:color="CCCCCC" w:sz="1"/>
@@ -754,7 +754,7 @@
       <w:tr>
         <w:tc>
           <w:tcPr>
-            <w:tcW w:type="dxa" w:w="1100"/>
+            <w:tcW w:type="dxa" w:w="900"/>
             <w:tcBorders>
               <w:top w:val="single" w:color="CCCCCC" w:sz="1"/>
               <w:left w:val="single" w:color="CCCCCC" w:sz="1"/>
@@ -777,7 +777,7 @@
         </w:tc>
         <w:tc>
           <w:tcPr>
-            <w:tcW w:type="dxa" w:w="2600"/>
+            <w:tcW w:type="dxa" w:w="2500"/>
             <w:tcBorders>
               <w:top w:val="single" w:color="CCCCCC" w:sz="1"/>
               <w:left w:val="single" w:color="CCCCCC" w:sz="1"/>
@@ -800,7 +800,7 @@
         </w:tc>
         <w:tc>
           <w:tcPr>
-            <w:tcW w:type="dxa" w:w="2830"/>
+            <w:tcW w:type="dxa" w:w="3000"/>
             <w:tcBorders>
               <w:top w:val="single" w:color="CCCCCC" w:sz="1"/>
               <w:left w:val="single" w:color="CCCCCC" w:sz="1"/>
@@ -817,13 +817,13 @@
           </w:tcPr>
           <w:p>
             <w:r>
-              <w:t xml:space="preserve">Eenvoudiger dashboard, getoond als webpagina via een webhook</w:t>
-            </w:r>
-          </w:p>
-        </w:tc>
-        <w:tc>
-          <w:tcPr>
-            <w:tcW w:type="dxa" w:w="2830"/>
+              <w:t xml:space="preserve">Eenvoudiger dashboard als webpagina via webhook</w:t>
+            </w:r>
+          </w:p>
+        </w:tc>
+        <w:tc>
+          <w:tcPr>
+            <w:tcW w:type="dxa" w:w="2960"/>
             <w:tcBorders>
               <w:top w:val="single" w:color="CCCCCC" w:sz="1"/>
               <w:left w:val="single" w:color="CCCCCC" w:sz="1"/>
@@ -840,7 +840,375 @@
           </w:tcPr>
           <w:p>
             <w:r>
-              <w:t xml:space="preserve">Databron nog niet gekoppeld — dit is mijn huidige werkpunt</w:t>
+              <w:t xml:space="preserve">Databron (n8n Data Table) was niet gekoppeld; ik ontdekte dat de juiste databron de Google Sheets-log was</w:t>
+            </w:r>
+          </w:p>
+        </w:tc>
+      </w:tr>
+      <w:tr>
+        <w:tc>
+          <w:tcPr>
+            <w:tcW w:type="dxa" w:w="900"/>
+            <w:tcBorders>
+              <w:top w:val="single" w:color="CCCCCC" w:sz="1"/>
+              <w:left w:val="single" w:color="CCCCCC" w:sz="1"/>
+              <w:bottom w:val="single" w:color="CCCCCC" w:sz="1"/>
+              <w:right w:val="single" w:color="CCCCCC" w:sz="1"/>
+            </w:tcBorders>
+            <w:tcMar>
+              <w:top w:type="dxa" w:w="80"/>
+              <w:left w:type="dxa" w:w="120"/>
+              <w:bottom w:type="dxa" w:w="80"/>
+              <w:right w:type="dxa" w:w="120"/>
+            </w:tcMar>
+          </w:tcPr>
+          <w:p>
+            <w:r>
+              <w:t xml:space="preserve">4</w:t>
+            </w:r>
+          </w:p>
+        </w:tc>
+        <w:tc>
+          <w:tcPr>
+            <w:tcW w:type="dxa" w:w="2500"/>
+            <w:tcBorders>
+              <w:top w:val="single" w:color="CCCCCC" w:sz="1"/>
+              <w:left w:val="single" w:color="CCCCCC" w:sz="1"/>
+              <w:bottom w:val="single" w:color="CCCCCC" w:sz="1"/>
+              <w:right w:val="single" w:color="CCCCCC" w:sz="1"/>
+            </w:tcBorders>
+            <w:tcMar>
+              <w:top w:type="dxa" w:w="80"/>
+              <w:left w:type="dxa" w:w="120"/>
+              <w:bottom w:type="dxa" w:w="80"/>
+              <w:right w:type="dxa" w:w="120"/>
+            </w:tcMar>
+          </w:tcPr>
+          <w:p>
+            <w:r>
+              <w:t xml:space="preserve">Webhook werkend (v4_webhook_werkend.json)</w:t>
+            </w:r>
+          </w:p>
+        </w:tc>
+        <w:tc>
+          <w:tcPr>
+            <w:tcW w:type="dxa" w:w="3000"/>
+            <w:tcBorders>
+              <w:top w:val="single" w:color="CCCCCC" w:sz="1"/>
+              <w:left w:val="single" w:color="CCCCCC" w:sz="1"/>
+              <w:bottom w:val="single" w:color="CCCCCC" w:sz="1"/>
+              <w:right w:val="single" w:color="CCCCCC" w:sz="1"/>
+            </w:tcBorders>
+            <w:tcMar>
+              <w:top w:type="dxa" w:w="80"/>
+              <w:left w:type="dxa" w:w="120"/>
+              <w:bottom w:type="dxa" w:w="80"/>
+              <w:right w:type="dxa" w:w="120"/>
+            </w:tcMar>
+          </w:tcPr>
+          <w:p>
+            <w:r>
+              <w:t xml:space="preserve">Webpagina-dashboard dat correct uit de log-sheet leest</w:t>
+            </w:r>
+          </w:p>
+        </w:tc>
+        <w:tc>
+          <w:tcPr>
+            <w:tcW w:type="dxa" w:w="2960"/>
+            <w:tcBorders>
+              <w:top w:val="single" w:color="CCCCCC" w:sz="1"/>
+              <w:left w:val="single" w:color="CCCCCC" w:sz="1"/>
+              <w:bottom w:val="single" w:color="CCCCCC" w:sz="1"/>
+              <w:right w:val="single" w:color="CCCCCC" w:sz="1"/>
+            </w:tcBorders>
+            <w:tcMar>
+              <w:top w:type="dxa" w:w="80"/>
+              <w:left w:type="dxa" w:w="120"/>
+              <w:bottom w:type="dxa" w:w="80"/>
+              <w:right w:type="dxa" w:w="120"/>
+            </w:tcMar>
+          </w:tcPr>
+          <w:p>
+            <w:r>
+              <w:t xml:space="preserve">Wilde dezelfde werkende opzet ook per e-mail kunnen tonen</w:t>
+            </w:r>
+          </w:p>
+        </w:tc>
+      </w:tr>
+      <w:tr>
+        <w:tc>
+          <w:tcPr>
+            <w:tcW w:type="dxa" w:w="900"/>
+            <w:tcBorders>
+              <w:top w:val="single" w:color="CCCCCC" w:sz="1"/>
+              <w:left w:val="single" w:color="CCCCCC" w:sz="1"/>
+              <w:bottom w:val="single" w:color="CCCCCC" w:sz="1"/>
+              <w:right w:val="single" w:color="CCCCCC" w:sz="1"/>
+            </w:tcBorders>
+            <w:shd w:fill="F2F5FA" w:val="clear"/>
+            <w:tcMar>
+              <w:top w:type="dxa" w:w="80"/>
+              <w:left w:type="dxa" w:w="120"/>
+              <w:bottom w:type="dxa" w:w="80"/>
+              <w:right w:type="dxa" w:w="120"/>
+            </w:tcMar>
+          </w:tcPr>
+          <w:p>
+            <w:r>
+              <w:t xml:space="preserve">5</w:t>
+            </w:r>
+          </w:p>
+        </w:tc>
+        <w:tc>
+          <w:tcPr>
+            <w:tcW w:type="dxa" w:w="2500"/>
+            <w:tcBorders>
+              <w:top w:val="single" w:color="CCCCCC" w:sz="1"/>
+              <w:left w:val="single" w:color="CCCCCC" w:sz="1"/>
+              <w:bottom w:val="single" w:color="CCCCCC" w:sz="1"/>
+              <w:right w:val="single" w:color="CCCCCC" w:sz="1"/>
+            </w:tcBorders>
+            <w:shd w:fill="F2F5FA" w:val="clear"/>
+            <w:tcMar>
+              <w:top w:type="dxa" w:w="80"/>
+              <w:left w:type="dxa" w:w="120"/>
+              <w:bottom w:type="dxa" w:w="80"/>
+              <w:right w:type="dxa" w:w="120"/>
+            </w:tcMar>
+          </w:tcPr>
+          <w:p>
+            <w:r>
+              <w:t xml:space="preserve">E-mail werkend (v5_email_werkend.json)</w:t>
+            </w:r>
+          </w:p>
+        </w:tc>
+        <w:tc>
+          <w:tcPr>
+            <w:tcW w:type="dxa" w:w="3000"/>
+            <w:tcBorders>
+              <w:top w:val="single" w:color="CCCCCC" w:sz="1"/>
+              <w:left w:val="single" w:color="CCCCCC" w:sz="1"/>
+              <w:bottom w:val="single" w:color="CCCCCC" w:sz="1"/>
+              <w:right w:val="single" w:color="CCCCCC" w:sz="1"/>
+            </w:tcBorders>
+            <w:shd w:fill="F2F5FA" w:val="clear"/>
+            <w:tcMar>
+              <w:top w:type="dxa" w:w="80"/>
+              <w:left w:type="dxa" w:w="120"/>
+              <w:bottom w:type="dxa" w:w="80"/>
+              <w:right w:type="dxa" w:w="120"/>
+            </w:tcMar>
+          </w:tcPr>
+          <w:p>
+            <w:r>
+              <w:t xml:space="preserve">Hetzelfde dashboard, mail-veilig opgemaakt en per e-mail verstuurd</w:t>
+            </w:r>
+          </w:p>
+        </w:tc>
+        <w:tc>
+          <w:tcPr>
+            <w:tcW w:type="dxa" w:w="2960"/>
+            <w:tcBorders>
+              <w:top w:val="single" w:color="CCCCCC" w:sz="1"/>
+              <w:left w:val="single" w:color="CCCCCC" w:sz="1"/>
+              <w:bottom w:val="single" w:color="CCCCCC" w:sz="1"/>
+              <w:right w:val="single" w:color="CCCCCC" w:sz="1"/>
+            </w:tcBorders>
+            <w:shd w:fill="F2F5FA" w:val="clear"/>
+            <w:tcMar>
+              <w:top w:type="dxa" w:w="80"/>
+              <w:left w:type="dxa" w:w="120"/>
+              <w:bottom w:type="dxa" w:w="80"/>
+              <w:right w:type="dxa" w:w="120"/>
+            </w:tcMar>
+          </w:tcPr>
+          <w:p>
+            <w:r>
+              <w:t xml:space="preserve">Dashboard miste nog de KPI's die de opdrachtgever wil meten</w:t>
+            </w:r>
+          </w:p>
+        </w:tc>
+      </w:tr>
+      <w:tr>
+        <w:tc>
+          <w:tcPr>
+            <w:tcW w:type="dxa" w:w="900"/>
+            <w:tcBorders>
+              <w:top w:val="single" w:color="CCCCCC" w:sz="1"/>
+              <w:left w:val="single" w:color="CCCCCC" w:sz="1"/>
+              <w:bottom w:val="single" w:color="CCCCCC" w:sz="1"/>
+              <w:right w:val="single" w:color="CCCCCC" w:sz="1"/>
+            </w:tcBorders>
+            <w:tcMar>
+              <w:top w:type="dxa" w:w="80"/>
+              <w:left w:type="dxa" w:w="120"/>
+              <w:bottom w:type="dxa" w:w="80"/>
+              <w:right w:type="dxa" w:w="120"/>
+            </w:tcMar>
+          </w:tcPr>
+          <w:p>
+            <w:r>
+              <w:t xml:space="preserve">6</w:t>
+            </w:r>
+          </w:p>
+        </w:tc>
+        <w:tc>
+          <w:tcPr>
+            <w:tcW w:type="dxa" w:w="2500"/>
+            <w:tcBorders>
+              <w:top w:val="single" w:color="CCCCCC" w:sz="1"/>
+              <w:left w:val="single" w:color="CCCCCC" w:sz="1"/>
+              <w:bottom w:val="single" w:color="CCCCCC" w:sz="1"/>
+              <w:right w:val="single" w:color="CCCCCC" w:sz="1"/>
+            </w:tcBorders>
+            <w:tcMar>
+              <w:top w:type="dxa" w:w="80"/>
+              <w:left w:type="dxa" w:w="120"/>
+              <w:bottom w:type="dxa" w:w="80"/>
+              <w:right w:type="dxa" w:w="120"/>
+            </w:tcMar>
+          </w:tcPr>
+          <w:p>
+            <w:r>
+              <w:t xml:space="preserve">Webhook met KPI's (v6_webhook_kpi.json)</w:t>
+            </w:r>
+          </w:p>
+        </w:tc>
+        <w:tc>
+          <w:tcPr>
+            <w:tcW w:type="dxa" w:w="3000"/>
+            <w:tcBorders>
+              <w:top w:val="single" w:color="CCCCCC" w:sz="1"/>
+              <w:left w:val="single" w:color="CCCCCC" w:sz="1"/>
+              <w:bottom w:val="single" w:color="CCCCCC" w:sz="1"/>
+              <w:right w:val="single" w:color="CCCCCC" w:sz="1"/>
+            </w:tcBorders>
+            <w:tcMar>
+              <w:top w:type="dxa" w:w="80"/>
+              <w:left w:type="dxa" w:w="120"/>
+              <w:bottom w:type="dxa" w:w="80"/>
+              <w:right w:type="dxa" w:w="120"/>
+            </w:tcMar>
+          </w:tcPr>
+          <w:p>
+            <w:r>
+              <w:t xml:space="preserve">Webpagina-dashboard met de drie KPI's (gauge, heatmap, top-fouten)</w:t>
+            </w:r>
+          </w:p>
+        </w:tc>
+        <w:tc>
+          <w:tcPr>
+            <w:tcW w:type="dxa" w:w="2960"/>
+            <w:tcBorders>
+              <w:top w:val="single" w:color="CCCCCC" w:sz="1"/>
+              <w:left w:val="single" w:color="CCCCCC" w:sz="1"/>
+              <w:bottom w:val="single" w:color="CCCCCC" w:sz="1"/>
+              <w:right w:val="single" w:color="CCCCCC" w:sz="1"/>
+            </w:tcBorders>
+            <w:tcMar>
+              <w:top w:type="dxa" w:w="80"/>
+              <w:left w:type="dxa" w:w="120"/>
+              <w:bottom w:type="dxa" w:w="80"/>
+              <w:right w:type="dxa" w:w="120"/>
+            </w:tcMar>
+          </w:tcPr>
+          <w:p>
+            <w:r>
+              <w:t xml:space="preserve">Huidige versie (webpagina)</w:t>
+            </w:r>
+          </w:p>
+        </w:tc>
+      </w:tr>
+      <w:tr>
+        <w:tc>
+          <w:tcPr>
+            <w:tcW w:type="dxa" w:w="900"/>
+            <w:tcBorders>
+              <w:top w:val="single" w:color="CCCCCC" w:sz="1"/>
+              <w:left w:val="single" w:color="CCCCCC" w:sz="1"/>
+              <w:bottom w:val="single" w:color="CCCCCC" w:sz="1"/>
+              <w:right w:val="single" w:color="CCCCCC" w:sz="1"/>
+            </w:tcBorders>
+            <w:shd w:fill="F2F5FA" w:val="clear"/>
+            <w:tcMar>
+              <w:top w:type="dxa" w:w="80"/>
+              <w:left w:type="dxa" w:w="120"/>
+              <w:bottom w:type="dxa" w:w="80"/>
+              <w:right w:type="dxa" w:w="120"/>
+            </w:tcMar>
+          </w:tcPr>
+          <w:p>
+            <w:r>
+              <w:t xml:space="preserve">7</w:t>
+            </w:r>
+          </w:p>
+        </w:tc>
+        <w:tc>
+          <w:tcPr>
+            <w:tcW w:type="dxa" w:w="2500"/>
+            <w:tcBorders>
+              <w:top w:val="single" w:color="CCCCCC" w:sz="1"/>
+              <w:left w:val="single" w:color="CCCCCC" w:sz="1"/>
+              <w:bottom w:val="single" w:color="CCCCCC" w:sz="1"/>
+              <w:right w:val="single" w:color="CCCCCC" w:sz="1"/>
+            </w:tcBorders>
+            <w:shd w:fill="F2F5FA" w:val="clear"/>
+            <w:tcMar>
+              <w:top w:type="dxa" w:w="80"/>
+              <w:left w:type="dxa" w:w="120"/>
+              <w:bottom w:type="dxa" w:w="80"/>
+              <w:right w:type="dxa" w:w="120"/>
+            </w:tcMar>
+          </w:tcPr>
+          <w:p>
+            <w:r>
+              <w:t xml:space="preserve">E-mail met KPI's (v7_email_kpi.json)</w:t>
+            </w:r>
+          </w:p>
+        </w:tc>
+        <w:tc>
+          <w:tcPr>
+            <w:tcW w:type="dxa" w:w="3000"/>
+            <w:tcBorders>
+              <w:top w:val="single" w:color="CCCCCC" w:sz="1"/>
+              <w:left w:val="single" w:color="CCCCCC" w:sz="1"/>
+              <w:bottom w:val="single" w:color="CCCCCC" w:sz="1"/>
+              <w:right w:val="single" w:color="CCCCCC" w:sz="1"/>
+            </w:tcBorders>
+            <w:shd w:fill="F2F5FA" w:val="clear"/>
+            <w:tcMar>
+              <w:top w:type="dxa" w:w="80"/>
+              <w:left w:type="dxa" w:w="120"/>
+              <w:bottom w:type="dxa" w:w="80"/>
+              <w:right w:type="dxa" w:w="120"/>
+            </w:tcMar>
+          </w:tcPr>
+          <w:p>
+            <w:r>
+              <w:t xml:space="preserve">Hetzelfde KPI-dashboard, mail-veilig per e-mail</w:t>
+            </w:r>
+          </w:p>
+        </w:tc>
+        <w:tc>
+          <w:tcPr>
+            <w:tcW w:type="dxa" w:w="2960"/>
+            <w:tcBorders>
+              <w:top w:val="single" w:color="CCCCCC" w:sz="1"/>
+              <w:left w:val="single" w:color="CCCCCC" w:sz="1"/>
+              <w:bottom w:val="single" w:color="CCCCCC" w:sz="1"/>
+              <w:right w:val="single" w:color="CCCCCC" w:sz="1"/>
+            </w:tcBorders>
+            <w:shd w:fill="F2F5FA" w:val="clear"/>
+            <w:tcMar>
+              <w:top w:type="dxa" w:w="80"/>
+              <w:left w:type="dxa" w:w="120"/>
+              <w:bottom w:type="dxa" w:w="80"/>
+              <w:right w:type="dxa" w:w="120"/>
+            </w:tcMar>
+          </w:tcPr>
+          <w:p>
+            <w:r>
+              <w:t xml:space="preserve">Huidige versie (e-mail)</w:t>
             </w:r>
           </w:p>
         </w:tc>
@@ -855,6 +1223,9 @@
       </w:r>
     </w:p>
     <w:p>
+      <w:pPr>
+        <w:spacing w:before="80"/>
+      </w:pPr>
       <w:r>
         <w:rPr>
           <w:b/>
@@ -867,6 +1238,9 @@
       </w:r>
     </w:p>
     <w:p>
+      <w:pPr>
+        <w:spacing w:before="80"/>
+      </w:pPr>
       <w:r>
         <w:rPr>
           <w:b/>
@@ -875,19 +1249,374 @@
         <w:t xml:space="preserve">Wat het was. </w:t>
       </w:r>
       <w:r>
-        <w:t xml:space="preserve">Mijn eerste poging was een AI-agent. De workflow bestond uit een chat-trigger, een AI Agent-node, een OpenAI-model (gpt-5-mini), een geheugen-node en een Google Sheets-tool waarmee de agent een spreadsheet kon aanmaken. Het idee was dat je via een chatgesprek met de agent zou kunnen werken.</w:t>
-      </w:r>
-    </w:p>
-    <w:p>
-      <w:pPr>
-        <w:spacing w:before="80"/>
-      </w:pPr>
-      <w:r>
-        <w:rPr>
-          <w:b/>
-          <w:bCs/>
-        </w:rPr>
-        <w:t xml:space="preserve">Wat er technisch in zat:</w:t>
+        <w:t xml:space="preserve">Mijn eerste poging was een AI-agent met een chat-trigger, een AI Agent-node, een OpenAI-model (gpt-5-mini), een geheugen-node en een Google Sheets-tool. Het idee was dat je via een chatgesprek met de agent zou kunnen werken.</w:t>
+      </w:r>
+    </w:p>
+    <w:p>
+      <w:pPr>
+        <w:spacing w:before="80"/>
+      </w:pPr>
+      <w:r>
+        <w:rPr>
+          <w:b/>
+          <w:bCs/>
+        </w:rPr>
+        <w:t xml:space="preserve">Waarom ik verder ging. </w:t>
+      </w:r>
+      <w:r>
+        <w:t xml:space="preserve">Deze opzet was te ingewikkeld voor wat ik nodig had. Een chatbot was niet wat ik zocht: mijn doel was een overzichtelijk dashboard, niet een gesprekspartner. Een chatbot botste bovendien met de belangrijkste klantverwachting, “makkelijk in gebruik” — de gebruiker moet weten wat hij moet typen en hoe hij de agent moet aansturen, en dat voelt niet natuurlijk.</w:t>
+      </w:r>
+    </w:p>
+    <w:p>
+      <w:pPr>
+        <w:spacing w:before="80"/>
+      </w:pPr>
+      <w:r>
+        <w:rPr>
+          <w:b/>
+          <w:bCs/>
+        </w:rPr>
+        <w:t xml:space="preserve">Wat ik hiervan leerde. </w:t>
+      </w:r>
+      <w:r>
+        <w:t xml:space="preserve">Een AI-agent is krachtig maar niet altijd het juiste gereedschap. Voor een vast overzicht past een gestructureerde workflow beter dan een open chat-agent.</w:t>
+      </w:r>
+    </w:p>
+    <w:p>
+      <w:pPr>
+        <w:pStyle w:val="Heading2"/>
+      </w:pPr>
+      <w:r>
+        <w:t xml:space="preserve">Iteratie 2 — Het Gmail-dashboard</w:t>
+      </w:r>
+    </w:p>
+    <w:p>
+      <w:pPr>
+        <w:spacing w:before="80"/>
+      </w:pPr>
+      <w:r>
+        <w:rPr>
+          <w:b/>
+          <w:bCs/>
+        </w:rPr>
+        <w:t xml:space="preserve">Bestand: </w:t>
+      </w:r>
+      <w:r>
+        <w:t xml:space="preserve">v2_gmail_dashboard.json</w:t>
+      </w:r>
+    </w:p>
+    <w:p>
+      <w:pPr>
+        <w:spacing w:before="80"/>
+      </w:pPr>
+      <w:r>
+        <w:rPr>
+          <w:b/>
+          <w:bCs/>
+        </w:rPr>
+        <w:t xml:space="preserve">Wat het was. </w:t>
+      </w:r>
+      <w:r>
+        <w:t xml:space="preserve">Een uitgebreide workflow die facturen uit een Google Sheet haalde, statistieken en validatiefouten berekende, grafieken genereerde en daarvan een HTML-dashboard bouwde dat dagelijks om 08:00 per e-mail werd verstuurd.</w:t>
+      </w:r>
+    </w:p>
+    <w:p>
+      <w:pPr>
+        <w:spacing w:before="80"/>
+      </w:pPr>
+      <w:r>
+        <w:rPr>
+          <w:b/>
+          <w:bCs/>
+        </w:rPr>
+        <w:t xml:space="preserve">Waarom ik verder ging. </w:t>
+      </w:r>
+      <w:r>
+        <w:t xml:space="preserve">De data uit Google Sheets werd niet goed uitgelezen. Op het dashboard toonde het validatie-overzicht een kapotte reeks losse cijfers, bleven de grafieken leeg en oogde de inhoud onbetrouwbaar. Een dashboard dat de gegevens niet correct toont, schiet zijn doel voorbij.</w:t>
+      </w:r>
+    </w:p>
+    <w:p>
+      <w:pPr>
+        <w:spacing w:before="80"/>
+      </w:pPr>
+      <w:r>
+        <w:rPr>
+          <w:b/>
+          <w:bCs/>
+        </w:rPr>
+        <w:t xml:space="preserve">Wat ik hiervan leerde. </w:t>
+      </w:r>
+      <w:r>
+        <w:t xml:space="preserve">Veel functies tegelijk toevoegen maakt een workflow kwetsbaar. Als de databron-koppeling en de dataverwerking niet kloppen, helpt mooie opmaak niets. Eerst de data goed laten stromen, dan pas uitbreiden.</w:t>
+      </w:r>
+    </w:p>
+    <w:p>
+      <w:pPr>
+        <w:pStyle w:val="Heading2"/>
+      </w:pPr>
+      <w:r>
+        <w:t xml:space="preserve">Iteratie 3 — Het Webhook-dashboard</w:t>
+      </w:r>
+    </w:p>
+    <w:p>
+      <w:pPr>
+        <w:spacing w:before="80"/>
+      </w:pPr>
+      <w:r>
+        <w:rPr>
+          <w:b/>
+          <w:bCs/>
+        </w:rPr>
+        <w:t xml:space="preserve">Bestand: </w:t>
+      </w:r>
+      <w:r>
+        <w:t xml:space="preserve">v3_webhook_dashboard.json</w:t>
+      </w:r>
+    </w:p>
+    <w:p>
+      <w:pPr>
+        <w:spacing w:before="80"/>
+      </w:pPr>
+      <w:r>
+        <w:rPr>
+          <w:b/>
+          <w:bCs/>
+        </w:rPr>
+        <w:t xml:space="preserve">Wat het was. </w:t>
+      </w:r>
+      <w:r>
+        <w:t xml:space="preserve">Een eenvoudiger opzet, gemaakt met de AI van N8N. In plaats van mailen wordt het dashboard via een webhook als webpagina aangeboden.</w:t>
+      </w:r>
+    </w:p>
+    <w:p>
+      <w:pPr>
+        <w:spacing w:before="80"/>
+      </w:pPr>
+      <w:r>
+        <w:rPr>
+          <w:b/>
+          <w:bCs/>
+        </w:rPr>
+        <w:t xml:space="preserve">Waarom deze aanpak. </w:t>
+      </w:r>
+      <w:r>
+        <w:t xml:space="preserve">De keuze voor een webpagina sluit aan op de twee belangrijkste klantverwachtingen: “makkelijk in gebruik” (gewoon een link openen) en “laagdrempelig” (iedereen kan een webpagina openen zonder hulp).</w:t>
+      </w:r>
+    </w:p>
+    <w:p>
+      <w:pPr>
+        <w:spacing w:before="80"/>
+      </w:pPr>
+      <w:r>
+        <w:rPr>
+          <w:b/>
+          <w:bCs/>
+        </w:rPr>
+        <w:t xml:space="preserve">Waarom ik verder ging. </w:t>
+      </w:r>
+      <w:r>
+        <w:t xml:space="preserve">Het dashboard bleef leeg. De databron was ingesteld op een lege n8n Data Table. Bij het uitzoeken ontdekte ik de werkelijke oorzaak: de verwerkte facturen staan in een Google Sheets-log (tabblad “Verwerkte facturen”) die door mijn factuurverwerkings-workflow wordt gevuld. Bovendien kwamen de veldnamen niet overeen — het dashboard zocht naar velden als factuurNummer en status, terwijl de sheet kolommen heet als factuurnummer en validatieResultaat. Dit verklaarde meteen waarom ook iteratie 2 leeg bleef.</w:t>
+      </w:r>
+    </w:p>
+    <w:p>
+      <w:pPr>
+        <w:spacing w:before="80"/>
+      </w:pPr>
+      <w:r>
+        <w:rPr>
+          <w:b/>
+          <w:bCs/>
+        </w:rPr>
+        <w:t xml:space="preserve">Wat ik hiervan leerde. </w:t>
+      </w:r>
+      <w:r>
+        <w:t xml:space="preserve">Een dashboard valt of staat met de juiste databron en exact overeenkomende veldnamen. Dit was het kantelpunt: pas met de echte log-sheet en de juiste kolomnamen kon het dashboard werken.</w:t>
+      </w:r>
+    </w:p>
+    <w:p>
+      <w:pPr>
+        <w:pStyle w:val="Heading2"/>
+      </w:pPr>
+      <w:r>
+        <w:t xml:space="preserve">Iteratie 4 — Webhook-dashboard werkend</w:t>
+      </w:r>
+    </w:p>
+    <w:p>
+      <w:pPr>
+        <w:spacing w:before="80"/>
+      </w:pPr>
+      <w:r>
+        <w:rPr>
+          <w:b/>
+          <w:bCs/>
+        </w:rPr>
+        <w:t xml:space="preserve">Bestand: </w:t>
+      </w:r>
+      <w:r>
+        <w:t xml:space="preserve">v4_webhook_werkend.json</w:t>
+      </w:r>
+    </w:p>
+    <w:p>
+      <w:pPr>
+        <w:spacing w:before="80"/>
+      </w:pPr>
+      <w:r>
+        <w:rPr>
+          <w:b/>
+          <w:bCs/>
+        </w:rPr>
+        <w:t xml:space="preserve">Wat het was. </w:t>
+      </w:r>
+      <w:r>
+        <w:t xml:space="preserve">Dezelfde webpagina-opzet als iteratie 3, maar nu gekoppeld aan de juiste databron (tabblad “Verwerkte facturen”). De veldnamen zijn afgestemd op de werkelijke kolomnamen en de bedragverwerking houdt rekening met de Nederlandse notatie (bijvoorbeeld 845,50).</w:t>
+      </w:r>
+    </w:p>
+    <w:p>
+      <w:pPr>
+        <w:spacing w:before="80"/>
+      </w:pPr>
+      <w:r>
+        <w:rPr>
+          <w:b/>
+          <w:bCs/>
+        </w:rPr>
+        <w:t xml:space="preserve">Waarom ik verder ging. </w:t>
+      </w:r>
+      <w:r>
+        <w:t xml:space="preserve">Met een werkende webpagina wilde ik dezelfde opzet ook per e-mail beschikbaar maken, zodat de opdrachtgever beide vormen kon vergelijken.</w:t>
+      </w:r>
+    </w:p>
+    <w:p>
+      <w:pPr>
+        <w:spacing w:before="80"/>
+      </w:pPr>
+      <w:r>
+        <w:rPr>
+          <w:b/>
+          <w:bCs/>
+        </w:rPr>
+        <w:t xml:space="preserve">Wat ik hiervan leerde. </w:t>
+      </w:r>
+      <w:r>
+        <w:t xml:space="preserve">Zodra de databron en veldnamen klopten, werkte het dashboard direct. De eerdere problemen lagen dus niet aan de opzet, maar aan de koppeling.</w:t>
+      </w:r>
+    </w:p>
+    <w:p>
+      <w:pPr>
+        <w:pStyle w:val="Heading2"/>
+      </w:pPr>
+      <w:r>
+        <w:t xml:space="preserve">Iteratie 5 — E-mail-dashboard werkend</w:t>
+      </w:r>
+    </w:p>
+    <w:p>
+      <w:pPr>
+        <w:spacing w:before="80"/>
+      </w:pPr>
+      <w:r>
+        <w:rPr>
+          <w:b/>
+          <w:bCs/>
+        </w:rPr>
+        <w:t xml:space="preserve">Bestand: </w:t>
+      </w:r>
+      <w:r>
+        <w:t xml:space="preserve">v5_email_werkend.json</w:t>
+      </w:r>
+    </w:p>
+    <w:p>
+      <w:pPr>
+        <w:spacing w:before="80"/>
+      </w:pPr>
+      <w:r>
+        <w:rPr>
+          <w:b/>
+          <w:bCs/>
+        </w:rPr>
+        <w:t xml:space="preserve">Wat het was. </w:t>
+      </w:r>
+      <w:r>
+        <w:t xml:space="preserve">Hetzelfde dashboard als iteratie 4, maar per e-mail. De opmaak is bewust mail-veilig gemaakt: tabellen en inline-styling in plaats van moderne CSS, omdat e-mailprogramma's als Gmail die opmaak vaak verwijderen. Dit voorkomt het opmaakprobleem van iteratie 2.</w:t>
+      </w:r>
+    </w:p>
+    <w:p>
+      <w:pPr>
+        <w:spacing w:before="80"/>
+      </w:pPr>
+      <w:r>
+        <w:rPr>
+          <w:b/>
+          <w:bCs/>
+        </w:rPr>
+        <w:t xml:space="preserve">Waarom ik verder ging. </w:t>
+      </w:r>
+      <w:r>
+        <w:t xml:space="preserve">Het dashboard toonde nog niet de KPI's die de opdrachtgever wil meten. Uit het Control Tower-ontwerp volgden twee vaste KPI's plus een overzicht van veelvoorkomende fouten.</w:t>
+      </w:r>
+    </w:p>
+    <w:p>
+      <w:pPr>
+        <w:spacing w:before="80"/>
+      </w:pPr>
+      <w:r>
+        <w:rPr>
+          <w:b/>
+          <w:bCs/>
+        </w:rPr>
+        <w:t xml:space="preserve">Wat ik hiervan leerde. </w:t>
+      </w:r>
+      <w:r>
+        <w:t xml:space="preserve">Mail-veilige opmaak vraagt een andere techniek dan een webpagina. Dezelfde data kan in twee weergaven, maar elke weergave heeft zijn eigen ontwerpregels.</w:t>
+      </w:r>
+    </w:p>
+    <w:p>
+      <w:pPr>
+        <w:pStyle w:val="Heading2"/>
+      </w:pPr>
+      <w:r>
+        <w:t xml:space="preserve">Iteratie 6 — Webhook-dashboard met KPI's</w:t>
+      </w:r>
+    </w:p>
+    <w:p>
+      <w:pPr>
+        <w:spacing w:before="80"/>
+      </w:pPr>
+      <w:r>
+        <w:rPr>
+          <w:b/>
+          <w:bCs/>
+        </w:rPr>
+        <w:t xml:space="preserve">Bestand: </w:t>
+      </w:r>
+      <w:r>
+        <w:t xml:space="preserve">v6_webhook_kpi.json</w:t>
+      </w:r>
+    </w:p>
+    <w:p>
+      <w:pPr>
+        <w:spacing w:before="80"/>
+      </w:pPr>
+      <w:r>
+        <w:rPr>
+          <w:b/>
+          <w:bCs/>
+        </w:rPr>
+        <w:t xml:space="preserve">Wat het was. </w:t>
+      </w:r>
+      <w:r>
+        <w:t xml:space="preserve">De webpagina-versie uitgebreid met de drie KPI's uit het Control Tower-ontwerp. Het dashboard leest nu twee tabbladen uit de log: “Verwerkte facturen” en “Validatiefouten”.</w:t>
+      </w:r>
+    </w:p>
+    <w:p>
+      <w:pPr>
+        <w:spacing w:before="80"/>
+      </w:pPr>
+      <w:r>
+        <w:rPr>
+          <w:b/>
+          <w:bCs/>
+        </w:rPr>
+        <w:t xml:space="preserve">De KPI's:</w:t>
       </w:r>
     </w:p>
     <w:p>
@@ -899,7 +1628,7 @@
         </w:numPr>
       </w:pPr>
       <w:r>
-        <w:t xml:space="preserve">Trigger: een chatbericht</w:t>
+        <w:t xml:space="preserve">KPI 1 — Reductie handmatige handelingen: een gauge die het percentage handmatige handelingen toont (aandeel facturen met REVIEW of FATAL), met de 40%-doellijn gemarkeerd.</w:t>
       </w:r>
     </w:p>
     <w:p>
@@ -911,7 +1640,7 @@
         </w:numPr>
       </w:pPr>
       <w:r>
-        <w:t xml:space="preserve">AI Agent gekoppeld aan OpenAI</w:t>
+        <w:t xml:space="preserve">KPI 2 — Factuurkwaliteit per leverancier: een heatmap met per leverancier het percentage afwijkende facturen, van groen (geen afwijkingen) naar rood (veel afwijkingen). Bewust een benadering op factuurniveau; de exacte artikelmatch volgt zodra het tabblad Factuurregels wordt meegenomen.</w:t>
       </w:r>
     </w:p>
     <w:p>
@@ -923,37 +1652,28 @@
         </w:numPr>
       </w:pPr>
       <w:r>
-        <w:t xml:space="preserve">Geheugen-node (ingesteld op een contextlengte van 0)</w:t>
-      </w:r>
-    </w:p>
-    <w:p>
-      <w:pPr>
-        <w:pStyle w:val="ListParagraph"/>
-        <w:numPr>
-          <w:ilvl w:val="0"/>
-          <w:numId w:val="2"/>
-        </w:numPr>
-      </w:pPr>
-      <w:r>
-        <w:t xml:space="preserve">Google Sheets-tool om een spreadsheet aan te maken</w:t>
-      </w:r>
-    </w:p>
-    <w:p>
-      <w:pPr>
-        <w:spacing w:before="80"/>
-      </w:pPr>
-      <w:r>
-        <w:rPr>
-          <w:b/>
-          <w:bCs/>
-        </w:rPr>
-        <w:t xml:space="preserve">Waarom ik verder ging. </w:t>
-      </w:r>
-      <w:r>
-        <w:t xml:space="preserve">Deze opzet was te ingewikkeld voor wat ik nodig had. Belangrijker nog: een chatbot was niet wat ik zocht. Mijn doel was een overzichtelijk dashboard van de facturatie, niet een gesprekspartner. Een chatbot botste bovendien met de belangrijkste klantverwachting, “makkelijk in gebruik”: de gebruiker moet weten wat hij moet typen en hoe hij de agent moet aansturen. Dat voelt niet natuurlijk. Ik wilde meer grip op het resultaat en een vaste, herhaalbare weergave.</w:t>
-      </w:r>
-    </w:p>
-    <w:p>
+        <w:t xml:space="preserve">KPI 3 — Meest voorkomende fouten: een top-5 van foutcodes uit het tabblad “Validatiefouten”.</w:t>
+      </w:r>
+    </w:p>
+    <w:p>
+      <w:pPr>
+        <w:spacing w:before="80"/>
+      </w:pPr>
+      <w:r>
+        <w:rPr>
+          <w:b/>
+          <w:bCs/>
+        </w:rPr>
+        <w:t xml:space="preserve">Waarom deze aanpak. </w:t>
+      </w:r>
+      <w:r>
+        <w:t xml:space="preserve">De KPI's maken het dashboard “praktisch” (verwachting 4): het levert aantoonbaar inzicht in de voortgang van de automatisering en de factuurkwaliteit per leverancier.</w:t>
+      </w:r>
+    </w:p>
+    <w:p>
+      <w:pPr>
+        <w:spacing w:before="80"/>
+      </w:pPr>
       <w:r>
         <w:rPr>
           <w:b/>
@@ -962,7 +1682,7 @@
         <w:t xml:space="preserve">Wat ik hiervan leerde. </w:t>
       </w:r>
       <w:r>
-        <w:t xml:space="preserve">Een AI-agent is krachtig maar niet altijd het juiste gereedschap. Voor een vast overzicht past een gestructureerde workflow beter dan een open chat-agent.</w:t>
+        <w:t xml:space="preserve">Niet elke KPI uit het ontwerp is één-op-één meetbaar met de beschikbare data. Door eerlijk te benoemen dat KPI 2 een benadering is, blijft het dashboard betrouwbaar in plaats van schijnzekerheid te geven.</w:t>
       </w:r>
     </w:p>
     <w:p>
@@ -970,10 +1690,13 @@
         <w:pStyle w:val="Heading2"/>
       </w:pPr>
       <w:r>
-        <w:t xml:space="preserve">Iteratie 2 — Het Gmail-dashboard</w:t>
-      </w:r>
-    </w:p>
-    <w:p>
+        <w:t xml:space="preserve">Iteratie 7 — E-mail-dashboard met KPI's</w:t>
+      </w:r>
+    </w:p>
+    <w:p>
+      <w:pPr>
+        <w:spacing w:before="80"/>
+      </w:pPr>
       <w:r>
         <w:rPr>
           <w:b/>
@@ -982,10 +1705,13 @@
         <w:t xml:space="preserve">Bestand: </w:t>
       </w:r>
       <w:r>
-        <w:t xml:space="preserve">v2_gmail_dashboard.json</w:t>
-      </w:r>
-    </w:p>
-    <w:p>
+        <w:t xml:space="preserve">v7_email_kpi.json</w:t>
+      </w:r>
+    </w:p>
+    <w:p>
+      <w:pPr>
+        <w:spacing w:before="80"/>
+      </w:pPr>
       <w:r>
         <w:rPr>
           <w:b/>
@@ -994,109 +1720,28 @@
         <w:t xml:space="preserve">Wat het was. </w:t>
       </w:r>
       <w:r>
-        <w:t xml:space="preserve">Een veel uitgebreidere workflow die de facturen uit een Google Sheet haalde, statistieken berekende (aantal facturen, bedragen, BTW, unieke leveranciers), validatiefouten analyseerde, grafieken genereerde en daarvan een opgemaakt HTML-dashboard bouwde. Dat dashboard werd dagelijks om 08:00 uur per e-mail naar Gmail gestuurd, met daarnaast archivering van de gegevens.</w:t>
-      </w:r>
-    </w:p>
-    <w:p>
-      <w:pPr>
-        <w:spacing w:before="80"/>
-      </w:pPr>
-      <w:r>
-        <w:rPr>
-          <w:b/>
-          <w:bCs/>
-        </w:rPr>
-        <w:t xml:space="preserve">Wat er technisch in zat:</w:t>
-      </w:r>
-    </w:p>
-    <w:p>
-      <w:pPr>
-        <w:pStyle w:val="ListParagraph"/>
-        <w:numPr>
-          <w:ilvl w:val="0"/>
-          <w:numId w:val="2"/>
-        </w:numPr>
-      </w:pPr>
-      <w:r>
-        <w:t xml:space="preserve">Trigger: handmatig én een dagelijkse planning (08:00 uur)</w:t>
-      </w:r>
-    </w:p>
-    <w:p>
-      <w:pPr>
-        <w:pStyle w:val="ListParagraph"/>
-        <w:numPr>
-          <w:ilvl w:val="0"/>
-          <w:numId w:val="2"/>
-        </w:numPr>
-      </w:pPr>
-      <w:r>
-        <w:t xml:space="preserve">Databron: Google Sheets (echte spreadsheet)</w:t>
-      </w:r>
-    </w:p>
-    <w:p>
-      <w:pPr>
-        <w:pStyle w:val="ListParagraph"/>
-        <w:numPr>
-          <w:ilvl w:val="0"/>
-          <w:numId w:val="2"/>
-        </w:numPr>
-      </w:pPr>
-      <w:r>
-        <w:t xml:space="preserve">Bewerking: filteren op recente data, statistieken berekenen, validatiefouten samenvoegen, foutpatronen analyseren</w:t>
-      </w:r>
-    </w:p>
-    <w:p>
-      <w:pPr>
-        <w:pStyle w:val="ListParagraph"/>
-        <w:numPr>
-          <w:ilvl w:val="0"/>
-          <w:numId w:val="2"/>
-        </w:numPr>
-      </w:pPr>
-      <w:r>
-        <w:t xml:space="preserve">Grafieken via gegenereerde afbeeldings-URL's</w:t>
-      </w:r>
-    </w:p>
-    <w:p>
-      <w:pPr>
-        <w:pStyle w:val="ListParagraph"/>
-        <w:numPr>
-          <w:ilvl w:val="0"/>
-          <w:numId w:val="2"/>
-        </w:numPr>
-      </w:pPr>
-      <w:r>
-        <w:t xml:space="preserve">Opbouw van een uitgebreid HTML-dashboard met KPI's en grafieken</w:t>
-      </w:r>
-    </w:p>
-    <w:p>
-      <w:pPr>
-        <w:pStyle w:val="ListParagraph"/>
-        <w:numPr>
-          <w:ilvl w:val="0"/>
-          <w:numId w:val="2"/>
-        </w:numPr>
-      </w:pPr>
-      <w:r>
-        <w:t xml:space="preserve">Verzending per e-mail (Gmail) en archivering</w:t>
-      </w:r>
-    </w:p>
-    <w:p>
-      <w:pPr>
-        <w:spacing w:before="80"/>
-      </w:pPr>
-      <w:r>
-        <w:rPr>
-          <w:b/>
-          <w:bCs/>
-        </w:rPr>
-        <w:t xml:space="preserve">Waarom ik verder ging. </w:t>
-      </w:r>
-      <w:r>
-        <w:t xml:space="preserve">In de praktijk werd de data uit Google Sheets niet goed uitgelezen en verwerkt. Op het verzonden dashboard was te zien dat het validatie-overzicht een kapotte reeks toonde (een rij losse cijfers in plaats van een net statusoverzicht), dat de grafieken leeg bleven, en dat de inhoud daardoor onbetrouwbaar oogde. Een dashboard dat de gegevens niet correct toont, schiet zijn doel voorbij. Daarom besloot ik de aanpak te vereenvoudigen.</w:t>
-      </w:r>
-    </w:p>
-    <w:p>
+        <w:t xml:space="preserve">De e-mailversie met dezelfde drie KPI's, opnieuw mail-veilig opgemaakt. De gauge uit de webversie is hier vervangen door een mail-veilige voortgangsbalk, zodat de KPI ook in een e-mail goed weergegeven wordt.</w:t>
+      </w:r>
+    </w:p>
+    <w:p>
+      <w:pPr>
+        <w:spacing w:before="80"/>
+      </w:pPr>
+      <w:r>
+        <w:rPr>
+          <w:b/>
+          <w:bCs/>
+        </w:rPr>
+        <w:t xml:space="preserve">Waarom deze aanpak. </w:t>
+      </w:r>
+      <w:r>
+        <w:t xml:space="preserve">Zo zijn beide weergaven (webpagina en e-mail) inhoudelijk gelijkwaardig: dezelfde KPI's, dezelfde data, maar elk in een vorm die past bij het medium. De opdrachtgever kan een eerlijke vergelijking maken.</w:t>
+      </w:r>
+    </w:p>
+    <w:p>
+      <w:pPr>
+        <w:spacing w:before="80"/>
+      </w:pPr>
       <w:r>
         <w:rPr>
           <w:b/>
@@ -1105,7 +1750,7 @@
         <w:t xml:space="preserve">Wat ik hiervan leerde. </w:t>
       </w:r>
       <w:r>
-        <w:t xml:space="preserve">Veel functies tegelijk toevoegen maakt een workflow kwetsbaar. Als de databron-koppeling en de dataverwerking niet kloppen, helpt mooie opmaak niets. Eerst de data goed laten stromen, dan pas uitbreiden.</w:t>
+        <w:t xml:space="preserve">Een KPI-visualisatie moet je soms per medium anders vormgeven. De inhoud blijft gelijk, de techniek verschilt.</w:t>
       </w:r>
     </w:p>
     <w:p>
@@ -1113,155 +1758,22 @@
         <w:pStyle w:val="Heading2"/>
       </w:pPr>
       <w:r>
-        <w:t xml:space="preserve">Iteratie 3 — Het Webhook-dashboard</w:t>
-      </w:r>
-    </w:p>
-    <w:p>
-      <w:r>
-        <w:rPr>
-          <w:b/>
-          <w:bCs/>
-        </w:rPr>
-        <w:t xml:space="preserve">Bestand: </w:t>
-      </w:r>
-      <w:r>
-        <w:t xml:space="preserve">v3_webhook_dashboard.json</w:t>
-      </w:r>
-    </w:p>
-    <w:p>
-      <w:r>
-        <w:rPr>
-          <w:b/>
-          <w:bCs/>
-        </w:rPr>
-        <w:t xml:space="preserve">Wat het was. </w:t>
-      </w:r>
-      <w:r>
-        <w:t xml:space="preserve">Een eenvoudiger opzet, gemaakt met behulp van de AI van N8N. In plaats van het dashboard te mailen, wordt het nu via een webhook als webpagina aangeboden. De workflow haalt facturen op, berekent in een code-node de statistieken en bouwt daar een HTML-dashboard van met statistiekkaarten en een tabel van recente facturen.</w:t>
-      </w:r>
-    </w:p>
-    <w:p>
-      <w:pPr>
-        <w:spacing w:before="80"/>
-      </w:pPr>
-      <w:r>
-        <w:rPr>
-          <w:b/>
-          <w:bCs/>
-        </w:rPr>
-        <w:t xml:space="preserve">Wat er technisch in zat:</w:t>
-      </w:r>
-    </w:p>
-    <w:p>
-      <w:pPr>
-        <w:pStyle w:val="ListParagraph"/>
-        <w:numPr>
-          <w:ilvl w:val="0"/>
-          <w:numId w:val="2"/>
-        </w:numPr>
-      </w:pPr>
-      <w:r>
-        <w:t xml:space="preserve">Trigger: een webhook (de pagina is op te vragen via een URL)</w:t>
-      </w:r>
-    </w:p>
-    <w:p>
-      <w:pPr>
-        <w:pStyle w:val="ListParagraph"/>
-        <w:numPr>
-          <w:ilvl w:val="0"/>
-          <w:numId w:val="2"/>
-        </w:numPr>
-      </w:pPr>
-      <w:r>
-        <w:t xml:space="preserve">Databron: een n8n Data Table</w:t>
-      </w:r>
-    </w:p>
-    <w:p>
-      <w:pPr>
-        <w:pStyle w:val="ListParagraph"/>
-        <w:numPr>
-          <w:ilvl w:val="0"/>
-          <w:numId w:val="2"/>
-        </w:numPr>
-      </w:pPr>
-      <w:r>
-        <w:t xml:space="preserve">Bewerking: statistieken berekenen in een code-node</w:t>
-      </w:r>
-    </w:p>
-    <w:p>
-      <w:pPr>
-        <w:pStyle w:val="ListParagraph"/>
-        <w:numPr>
-          <w:ilvl w:val="0"/>
-          <w:numId w:val="2"/>
-        </w:numPr>
-      </w:pPr>
-      <w:r>
-        <w:t xml:space="preserve">Opbouw van een HTML-dashboard met overzichtskaarten en een factuurtabel</w:t>
-      </w:r>
-    </w:p>
-    <w:p>
-      <w:pPr>
-        <w:pStyle w:val="ListParagraph"/>
-        <w:numPr>
-          <w:ilvl w:val="0"/>
-          <w:numId w:val="2"/>
-        </w:numPr>
-      </w:pPr>
-      <w:r>
-        <w:t xml:space="preserve">Antwoord: het dashboard wordt als webpagina teruggestuurd</w:t>
-      </w:r>
-    </w:p>
-    <w:p>
-      <w:pPr>
-        <w:spacing w:before="80"/>
-      </w:pPr>
-      <w:r>
-        <w:rPr>
-          <w:b/>
-          <w:bCs/>
-        </w:rPr>
-        <w:t xml:space="preserve">Huidige status / werkpunt. </w:t>
-      </w:r>
-      <w:r>
-        <w:t xml:space="preserve">De databron is nog niet gekoppeld — het veld voor de Data Table is leeg. Daardoor werkt de koppeling met de gegevens nog niet. Dit is het punt waar ik nu aan werk.</w:t>
-      </w:r>
-    </w:p>
-    <w:p>
-      <w:r>
-        <w:rPr>
-          <w:b/>
-          <w:bCs/>
-        </w:rPr>
-        <w:t xml:space="preserve">Waarom deze aanpak. </w:t>
-      </w:r>
-      <w:r>
-        <w:t xml:space="preserve">De keuze voor een webpagina via een webhook sluit bewust aan op de twee belangrijkste klantverwachtingen. “Makkelijk in gebruik” (prioriteit 1): de gebruiker opent simpelweg een link in de browser en ziet meteen het overzicht, zonder een chatbot te hoeven aansturen of door e-mails te zoeken. “Laagdrempelig” (prioriteit 3): iedereen kan een webpagina openen zonder uitleg of externe hulp. Daarnaast loste deze aanpak het dataprobleem van iteratie 2 op door de verwerking te vereenvoudigen: minder stappen betekent minder kans dat de gegevens onderweg misgaan.</w:t>
-      </w:r>
-    </w:p>
-    <w:p>
-      <w:r>
-        <w:rPr>
-          <w:b/>
-          <w:bCs/>
-        </w:rPr>
-        <w:t xml:space="preserve">Wat ik hiervan leerde. </w:t>
-      </w:r>
-      <w:r>
-        <w:t xml:space="preserve">Door de klantverwachtingen als meetlat te gebruiken, werd de keuze voor de webpagina-aanpak logisch in plaats van willekeurig. Een browserpagina is voor de eindgebruiker natuurlijker en laagdrempeliger dan een chatbot of een e-mail. De volgende stap is het correct koppelen van de databron, zodat het dashboard de echte facturen toont en daarmee ook “praktisch” en “toepasbaar” wordt (verwachtingen 2 en 4).</w:t>
-      </w:r>
-    </w:p>
-    <w:p>
-      <w:pPr>
-        <w:pStyle w:val="Heading2"/>
-      </w:pPr>
-      <w:r>
         <w:t xml:space="preserve">Conclusie en vervolg</w:t>
       </w:r>
     </w:p>
     <w:p>
       <w:r>
-        <w:t xml:space="preserve">De ontwikkeling laat een duidelijke lijn zien: van een open AI-agent, via een te complex e-maildashboard, naar een eenvoudiger en beter passende webpagina-aanpak. Twee dingen stuurden die ontwikkeling: de technische problemen met de dataverwerking, en de klantverwachtingen van de opdrachtgever. Vooral “makkelijk in gebruik” en “laagdrempelig” (de twee hoogste prioriteiten) verklaren waarom ik uiteindelijk koos voor een dashboard dat je gewoon in de browser opent. Mijn volgende stap is het afmaken van iteratie 3: de databron correct koppelen, zodat het dashboard de echte facturen toont en daarmee ook aan de verwachtingen “toepasbaar” en “praktisch” voldoet.</w:t>
+        <w:t xml:space="preserve">De ontwikkeling laat een duidelijke lijn zien: van een open AI-agent (iteratie 1), via een te complex e-maildashboard (iteratie 2) en een eerste webpagina-poging (iteratie 3), naar een werkend dashboard zodra de juiste databron en veldnamen gevonden waren (iteratie 4-5), en ten slotte naar een dashboard dat de KPI's van de opdrachtgever toont (iteratie 6-7).</w:t>
+      </w:r>
+    </w:p>
+    <w:p>
+      <w:r>
+        <w:t xml:space="preserve">Twee dingen stuurden die ontwikkeling: de technische problemen met de databron en de dataverwerking, en de klantverwachtingen van de opdrachtgever. Het kantelpunt was de ontdekking dat de juiste databron de Google Sheets-log was, met exact overeenkomende veldnamen. Vanaf dat moment kon ik het dashboard niet alleen laten werken, maar ook uitbreiden met betekenisvolle KPI's.</w:t>
+      </w:r>
+    </w:p>
+    <w:p>
+      <w:r>
+        <w:t xml:space="preserve">Het dashboard bestaat nu in twee gelijkwaardige vormen — webpagina en e-mail — zodat de opdrachtgever kan kiezen welke het best past bij “makkelijk in gebruik” en “laagdrempelig”. Mijn volgende stap is het verfijnen van KPI 2: door ook het tabblad Factuurregels uit te lezen, kan de factuurkwaliteit op artikelniveau gemeten worden in plaats van op factuurniveau.</w:t>
       </w:r>
     </w:p>
     <w:sectPr>
@@ -1684,22 +2196,5 @@
       <w:szCs w:val="26"/>
     </w:rPr>
   </w:style>
-  <w:style w:type="paragraph" w:styleId="Heading3">
-    <w:name w:val="Heading 3"/>
-    <w:basedOn w:val="Normal"/>
-    <w:next w:val="Normal"/>
-    <w:qFormat/>
-    <w:pPr>
-      <w:spacing w:after="80" w:before="140"/>
-      <w:outlineLvl w:val="2"/>
-    </w:pPr>
-    <w:rPr>
-      <w:rFonts w:ascii="Arial" w:cs="Arial" w:eastAsia="Arial" w:hAnsi="Arial"/>
-      <w:b/>
-      <w:bCs/>
-      <w:sz w:val="23"/>
-      <w:szCs w:val="23"/>
-    </w:rPr>
-  </w:style>
 </w:styles>
 </file>
</xml_diff>

<commit_message>
docs(n8n): versiedocumentatie.docx bijgewerkt met iteratie 8 (Word = Markdown)
Co-Authored-By: Claude Opus 4.8 <noreply@anthropic.com>
</commit_message>
<xml_diff>
--- a/n8n/dashboard/versiedocumentatie.docx
+++ b/n8n/dashboard/versiedocumentatie.docx
@@ -1208,6 +1208,100 @@
           </w:tcPr>
           <w:p>
             <w:r>
+              <w:t xml:space="preserve">Opdrachtgever wilde één wekelijks overzicht i.p.v. een losse weergave</w:t>
+            </w:r>
+          </w:p>
+        </w:tc>
+      </w:tr>
+      <w:tr>
+        <w:tc>
+          <w:tcPr>
+            <w:tcW w:type="dxa" w:w="900"/>
+            <w:tcBorders>
+              <w:top w:val="single" w:color="CCCCCC" w:sz="1"/>
+              <w:left w:val="single" w:color="CCCCCC" w:sz="1"/>
+              <w:bottom w:val="single" w:color="CCCCCC" w:sz="1"/>
+              <w:right w:val="single" w:color="CCCCCC" w:sz="1"/>
+            </w:tcBorders>
+            <w:shd w:fill="F2F5FA" w:val="clear"/>
+            <w:tcMar>
+              <w:top w:type="dxa" w:w="80"/>
+              <w:left w:type="dxa" w:w="120"/>
+              <w:bottom w:type="dxa" w:w="80"/>
+              <w:right w:type="dxa" w:w="120"/>
+            </w:tcMar>
+          </w:tcPr>
+          <w:p>
+            <w:r>
+              <w:t xml:space="preserve">8</w:t>
+            </w:r>
+          </w:p>
+        </w:tc>
+        <w:tc>
+          <w:tcPr>
+            <w:tcW w:type="dxa" w:w="2500"/>
+            <w:tcBorders>
+              <w:top w:val="single" w:color="CCCCCC" w:sz="1"/>
+              <w:left w:val="single" w:color="CCCCCC" w:sz="1"/>
+              <w:bottom w:val="single" w:color="CCCCCC" w:sz="1"/>
+              <w:right w:val="single" w:color="CCCCCC" w:sz="1"/>
+            </w:tcBorders>
+            <w:shd w:fill="F2F5FA" w:val="clear"/>
+            <w:tcMar>
+              <w:top w:type="dxa" w:w="80"/>
+              <w:left w:type="dxa" w:w="120"/>
+              <w:bottom w:type="dxa" w:w="80"/>
+              <w:right w:type="dxa" w:w="120"/>
+            </w:tcMar>
+          </w:tcPr>
+          <w:p>
+            <w:r>
+              <w:t xml:space="preserve">Weekrapport (v8_email_weekrapport.json)</w:t>
+            </w:r>
+          </w:p>
+        </w:tc>
+        <w:tc>
+          <w:tcPr>
+            <w:tcW w:type="dxa" w:w="3000"/>
+            <w:tcBorders>
+              <w:top w:val="single" w:color="CCCCCC" w:sz="1"/>
+              <w:left w:val="single" w:color="CCCCCC" w:sz="1"/>
+              <w:bottom w:val="single" w:color="CCCCCC" w:sz="1"/>
+              <w:right w:val="single" w:color="CCCCCC" w:sz="1"/>
+            </w:tcBorders>
+            <w:shd w:fill="F2F5FA" w:val="clear"/>
+            <w:tcMar>
+              <w:top w:type="dxa" w:w="80"/>
+              <w:left w:type="dxa" w:w="120"/>
+              <w:bottom w:type="dxa" w:w="80"/>
+              <w:right w:type="dxa" w:w="120"/>
+            </w:tcMar>
+          </w:tcPr>
+          <w:p>
+            <w:r>
+              <w:t xml:space="preserve">Verbreed KPI-dashboard als wekelijks e-mailrapport, per factuurdatum-week</w:t>
+            </w:r>
+          </w:p>
+        </w:tc>
+        <w:tc>
+          <w:tcPr>
+            <w:tcW w:type="dxa" w:w="2960"/>
+            <w:tcBorders>
+              <w:top w:val="single" w:color="CCCCCC" w:sz="1"/>
+              <w:left w:val="single" w:color="CCCCCC" w:sz="1"/>
+              <w:bottom w:val="single" w:color="CCCCCC" w:sz="1"/>
+              <w:right w:val="single" w:color="CCCCCC" w:sz="1"/>
+            </w:tcBorders>
+            <w:shd w:fill="F2F5FA" w:val="clear"/>
+            <w:tcMar>
+              <w:top w:type="dxa" w:w="80"/>
+              <w:left w:type="dxa" w:w="120"/>
+              <w:bottom w:type="dxa" w:w="80"/>
+              <w:right w:type="dxa" w:w="120"/>
+            </w:tcMar>
+          </w:tcPr>
+          <w:p>
+            <w:r>
               <w:t xml:space="preserve">Huidige versie (e-mail)</w:t>
             </w:r>
           </w:p>
@@ -1758,12 +1852,155 @@
         <w:pStyle w:val="Heading2"/>
       </w:pPr>
       <w:r>
+        <w:t xml:space="preserve">Iteratie 8 — Weekrapport met verbrede KPI’s</w:t>
+      </w:r>
+    </w:p>
+    <w:p>
+      <w:pPr>
+        <w:spacing w:before="80"/>
+      </w:pPr>
+      <w:r>
+        <w:rPr>
+          <w:b/>
+          <w:bCs/>
+        </w:rPr>
+        <w:t xml:space="preserve">Bestand. </w:t>
+      </w:r>
+      <w:r>
+        <w:t xml:space="preserve">v8_email_weekrapport.json</w:t>
+      </w:r>
+    </w:p>
+    <w:p>
+      <w:pPr>
+        <w:spacing w:before="80"/>
+      </w:pPr>
+      <w:r>
+        <w:rPr>
+          <w:b/>
+          <w:bCs/>
+        </w:rPr>
+        <w:t xml:space="preserve">Wat het is. </w:t>
+      </w:r>
+      <w:r>
+        <w:t xml:space="preserve">De e-mailversie is fors verbreed en omgezet naar een wekelijks rapport. Het dashboard leest nog steeds de twee tabbladen “Verwerkte facturen” en “Validatiefouten”, maar gebruikt nu het rijkere schema van de nieuwe inkoopfacturatie-workflow (Mistral-extractie).</w:t>
+      </w:r>
+    </w:p>
+    <w:p>
+      <w:pPr>
+        <w:spacing w:before="80"/>
+      </w:pPr>
+      <w:r>
+        <w:rPr>
+          <w:b/>
+          <w:bCs/>
+        </w:rPr>
+        <w:t xml:space="preserve">Wat er nieuw is.</w:t>
+      </w:r>
+    </w:p>
+    <w:p>
+      <w:pPr>
+        <w:pStyle w:val="ListParagraph"/>
+        <w:numPr>
+          <w:ilvl w:val="0"/>
+          <w:numId w:val="2"/>
+        </w:numPr>
+      </w:pPr>
+      <w:r>
+        <w:t xml:space="preserve">Risicosignalen-blok (IBAN-afwijking, nieuwe/onbekende leverancier, lage AI-betrouwbaarheid, technische UBL-fouten) — vervangt de weggevallen risicoscore.</w:t>
+      </w:r>
+    </w:p>
+    <w:p>
+      <w:pPr>
+        <w:pStyle w:val="ListParagraph"/>
+        <w:numPr>
+          <w:ilvl w:val="0"/>
+          <w:numId w:val="2"/>
+        </w:numPr>
+      </w:pPr>
+      <w:r>
+        <w:t xml:space="preserve">KPI 4 — Technische factuurkwaliteit (UBL): percentage technisch valide facturen.</w:t>
+      </w:r>
+    </w:p>
+    <w:p>
+      <w:pPr>
+        <w:pStyle w:val="ListParagraph"/>
+        <w:numPr>
+          <w:ilvl w:val="0"/>
+          <w:numId w:val="2"/>
+        </w:numPr>
+      </w:pPr>
+      <w:r>
+        <w:t xml:space="preserve">Kwaliteitsrij: gemiddelde OCR-betrouwbaarheid, gemiddelde leveranciersmatch, percentage uniek gematcht, percentage regels zonder grootboekrekening, eenheidsnormalisatie en een samenvatting van de matchmethode.</w:t>
+      </w:r>
+    </w:p>
+    <w:p>
+      <w:pPr>
+        <w:pStyle w:val="ListParagraph"/>
+        <w:numPr>
+          <w:ilvl w:val="0"/>
+          <w:numId w:val="2"/>
+        </w:numPr>
+      </w:pPr>
+      <w:r>
+        <w:t xml:space="preserve">KPI 2 toont nu ook de gemiddelde matchbetrouwbaarheid per leverancier; KPI 3 toont het type fout (FATAL/REVIEW); plus een lijst “Facturen die aandacht vragen”.</w:t>
+      </w:r>
+    </w:p>
+    <w:p>
+      <w:pPr>
+        <w:spacing w:before="80"/>
+      </w:pPr>
+      <w:r>
+        <w:rPr>
+          <w:b/>
+          <w:bCs/>
+        </w:rPr>
+        <w:t xml:space="preserve">Wekelijks rapport. </w:t>
+      </w:r>
+      <w:r>
+        <w:t xml:space="preserve">De handmatige trigger is vervangen door een Schedule Trigger die elke maandag om 05:00 (Europe/Amsterdam) draait. Het dashboard vat de vorige kalenderweek (maandag t/m zondag) samen, gefilterd op factuurdatum. De validatiefouten worden via het factuurnummer aan diezelfde set facturen gekoppeld. Een handmatige test-trigger blijft beschikbaar.</w:t>
+      </w:r>
+    </w:p>
+    <w:p>
+      <w:pPr>
+        <w:spacing w:before="80"/>
+      </w:pPr>
+      <w:r>
+        <w:rPr>
+          <w:b/>
+          <w:bCs/>
+        </w:rPr>
+        <w:t xml:space="preserve">Waarom deze aanpak. </w:t>
+      </w:r>
+      <w:r>
+        <w:t xml:space="preserve">De opdrachtgever wil één wekelijks overzicht in plaats van een losse weergave. Filteren op factuurdatum sluit aan op hoe de administratie naar een week kijkt (de facturen van die week), niet op het toevallige moment van verwerken.</w:t>
+      </w:r>
+    </w:p>
+    <w:p>
+      <w:pPr>
+        <w:spacing w:before="80"/>
+      </w:pPr>
+      <w:r>
+        <w:rPr>
+          <w:b/>
+          <w:bCs/>
+        </w:rPr>
+        <w:t xml:space="preserve">Aandachtspunt. </w:t>
+      </w:r>
+      <w:r>
+        <w:t xml:space="preserve">Bij weinig facturen in een week worden percentages in KPI 2 en de gemiddelde-confidence-cijfers grof (bij één factuur 0% of 100%). De absolute aantallen ernaast houden het interpreteerbaar.</w:t>
+      </w:r>
+    </w:p>
+    <w:p>
+      <w:pPr>
+        <w:pStyle w:val="Heading2"/>
+      </w:pPr>
+      <w:r>
         <w:t xml:space="preserve">Conclusie en vervolg</w:t>
       </w:r>
     </w:p>
     <w:p>
       <w:r>
-        <w:t xml:space="preserve">De ontwikkeling laat een duidelijke lijn zien: van een open AI-agent (iteratie 1), via een te complex e-maildashboard (iteratie 2) en een eerste webpagina-poging (iteratie 3), naar een werkend dashboard zodra de juiste databron en veldnamen gevonden waren (iteratie 4-5), en ten slotte naar een dashboard dat de KPI's van de opdrachtgever toont (iteratie 6-7).</w:t>
+        <w:t xml:space="preserve">De ontwikkeling laat een duidelijke lijn zien: van een open AI-agent (iteratie 1), via een te complex e-maildashboard (iteratie 2) en een eerste webpagina-poging (iteratie 3), naar een werkend dashboard zodra de juiste databron en veldnamen gevonden waren (iteratie 4-5), en ten slotte naar een dashboard dat de KPI's van de opdrachtgever toont (iteratie 6-7), en ten slotte naar een wekelijks weekrapport met verbrede KPI's (iteratie 8).</w:t>
       </w:r>
     </w:p>
     <w:p>
@@ -1773,7 +2010,7 @@
     </w:p>
     <w:p>
       <w:r>
-        <w:t xml:space="preserve">Het dashboard bestaat nu in twee gelijkwaardige vormen — webpagina en e-mail — zodat de opdrachtgever kan kiezen welke het best past bij “makkelijk in gebruik” en “laagdrempelig”. Mijn volgende stap is het verfijnen van KPI 2: door ook het tabblad Factuurregels uit te lezen, kan de factuurkwaliteit op artikelniveau gemeten worden in plaats van op factuurniveau.</w:t>
+        <w:t xml:space="preserve">Het dashboard bestaat nu in twee gelijkwaardige vormen — de webpagina (v6_webhook_kpi.json) en het wekelijkse e-mailrapport (v8_email_weekrapport.json) — zodat de opdrachtgever kan kiezen welke het best past bij “makkelijk in gebruik” en “laagdrempelig”. Mijn volgende stap is het verfijnen van KPI 2: door ook het tabblad Factuurregels uit te lezen, kan de factuurkwaliteit op artikelniveau gemeten worden in plaats van op factuurniveau.</w:t>
       </w:r>
     </w:p>
     <w:sectPr>

</xml_diff>

<commit_message>
docs(n8n): versiedocumentatie.docx bijgewerkt met iteratie 9 + 10 (Word = Markdown)
Co-Authored-By: Claude Opus 4.8 <noreply@anthropic.com>
</commit_message>
<xml_diff>
--- a/n8n/dashboard/versiedocumentatie.docx
+++ b/n8n/dashboard/versiedocumentatie.docx
@@ -1302,6 +1302,194 @@
           </w:tcPr>
           <w:p>
             <w:r>
+              <w:t xml:space="preserve">Wilde ook een variant over de volledige dataset</w:t>
+            </w:r>
+          </w:p>
+        </w:tc>
+      </w:tr>
+      <w:tr>
+        <w:tc>
+          <w:tcPr>
+            <w:tcW w:type="dxa" w:w="900"/>
+            <w:tcBorders>
+              <w:top w:val="single" w:color="CCCCCC" w:sz="1"/>
+              <w:left w:val="single" w:color="CCCCCC" w:sz="1"/>
+              <w:bottom w:val="single" w:color="CCCCCC" w:sz="1"/>
+              <w:right w:val="single" w:color="CCCCCC" w:sz="1"/>
+            </w:tcBorders>
+            <w:shd w:fill="F2F5FA" w:val="clear"/>
+            <w:tcMar>
+              <w:top w:type="dxa" w:w="80"/>
+              <w:left w:type="dxa" w:w="120"/>
+              <w:bottom w:type="dxa" w:w="80"/>
+              <w:right w:type="dxa" w:w="120"/>
+            </w:tcMar>
+          </w:tcPr>
+          <w:p>
+            <w:r>
+              <w:t xml:space="preserve">9</w:t>
+            </w:r>
+          </w:p>
+        </w:tc>
+        <w:tc>
+          <w:tcPr>
+            <w:tcW w:type="dxa" w:w="2500"/>
+            <w:tcBorders>
+              <w:top w:val="single" w:color="CCCCCC" w:sz="1"/>
+              <w:left w:val="single" w:color="CCCCCC" w:sz="1"/>
+              <w:bottom w:val="single" w:color="CCCCCC" w:sz="1"/>
+              <w:right w:val="single" w:color="CCCCCC" w:sz="1"/>
+            </w:tcBorders>
+            <w:shd w:fill="F2F5FA" w:val="clear"/>
+            <w:tcMar>
+              <w:top w:type="dxa" w:w="80"/>
+              <w:left w:type="dxa" w:w="120"/>
+              <w:bottom w:type="dxa" w:w="80"/>
+              <w:right w:type="dxa" w:w="120"/>
+            </w:tcMar>
+          </w:tcPr>
+          <w:p>
+            <w:r>
+              <w:t xml:space="preserve">Volledig overzicht (v9_email_volledig.json)</w:t>
+            </w:r>
+          </w:p>
+        </w:tc>
+        <w:tc>
+          <w:tcPr>
+            <w:tcW w:type="dxa" w:w="3000"/>
+            <w:tcBorders>
+              <w:top w:val="single" w:color="CCCCCC" w:sz="1"/>
+              <w:left w:val="single" w:color="CCCCCC" w:sz="1"/>
+              <w:bottom w:val="single" w:color="CCCCCC" w:sz="1"/>
+              <w:right w:val="single" w:color="CCCCCC" w:sz="1"/>
+            </w:tcBorders>
+            <w:shd w:fill="F2F5FA" w:val="clear"/>
+            <w:tcMar>
+              <w:top w:type="dxa" w:w="80"/>
+              <w:left w:type="dxa" w:w="120"/>
+              <w:bottom w:type="dxa" w:w="80"/>
+              <w:right w:type="dxa" w:w="120"/>
+            </w:tcMar>
+          </w:tcPr>
+          <w:p>
+            <w:r>
+              <w:t xml:space="preserve">Verbreed KPI-dashboard als wekelijks e-mailrapport, per factuurdatum-week</w:t>
+            </w:r>
+          </w:p>
+        </w:tc>
+        <w:tc>
+          <w:tcPr>
+            <w:tcW w:type="dxa" w:w="2960"/>
+            <w:tcBorders>
+              <w:top w:val="single" w:color="CCCCCC" w:sz="1"/>
+              <w:left w:val="single" w:color="CCCCCC" w:sz="1"/>
+              <w:bottom w:val="single" w:color="CCCCCC" w:sz="1"/>
+              <w:right w:val="single" w:color="CCCCCC" w:sz="1"/>
+            </w:tcBorders>
+            <w:shd w:fill="F2F5FA" w:val="clear"/>
+            <w:tcMar>
+              <w:top w:type="dxa" w:w="80"/>
+              <w:left w:type="dxa" w:w="120"/>
+              <w:bottom w:type="dxa" w:w="80"/>
+              <w:right w:type="dxa" w:w="120"/>
+            </w:tcMar>
+          </w:tcPr>
+          <w:p>
+            <w:r>
+              <w:t xml:space="preserve">Terug naar een wekelijks ritme, nu met de nieuwe databron</w:t>
+            </w:r>
+          </w:p>
+        </w:tc>
+      </w:tr>
+      <w:tr>
+        <w:tc>
+          <w:tcPr>
+            <w:tcW w:type="dxa" w:w="900"/>
+            <w:tcBorders>
+              <w:top w:val="single" w:color="CCCCCC" w:sz="1"/>
+              <w:left w:val="single" w:color="CCCCCC" w:sz="1"/>
+              <w:bottom w:val="single" w:color="CCCCCC" w:sz="1"/>
+              <w:right w:val="single" w:color="CCCCCC" w:sz="1"/>
+            </w:tcBorders>
+            <w:shd w:fill="F2F5FA" w:val="clear"/>
+            <w:tcMar>
+              <w:top w:type="dxa" w:w="80"/>
+              <w:left w:type="dxa" w:w="120"/>
+              <w:bottom w:type="dxa" w:w="80"/>
+              <w:right w:type="dxa" w:w="120"/>
+            </w:tcMar>
+          </w:tcPr>
+          <w:p>
+            <w:r>
+              <w:t xml:space="preserve">10</w:t>
+            </w:r>
+          </w:p>
+        </w:tc>
+        <w:tc>
+          <w:tcPr>
+            <w:tcW w:type="dxa" w:w="2500"/>
+            <w:tcBorders>
+              <w:top w:val="single" w:color="CCCCCC" w:sz="1"/>
+              <w:left w:val="single" w:color="CCCCCC" w:sz="1"/>
+              <w:bottom w:val="single" w:color="CCCCCC" w:sz="1"/>
+              <w:right w:val="single" w:color="CCCCCC" w:sz="1"/>
+            </w:tcBorders>
+            <w:shd w:fill="F2F5FA" w:val="clear"/>
+            <w:tcMar>
+              <w:top w:type="dxa" w:w="80"/>
+              <w:left w:type="dxa" w:w="120"/>
+              <w:bottom w:type="dxa" w:w="80"/>
+              <w:right w:type="dxa" w:w="120"/>
+            </w:tcMar>
+          </w:tcPr>
+          <w:p>
+            <w:r>
+              <w:t xml:space="preserve">Weekrapport nieuwe koppeling (v10_email_weekrapport_nieuwe-koppeling.json)</w:t>
+            </w:r>
+          </w:p>
+        </w:tc>
+        <w:tc>
+          <w:tcPr>
+            <w:tcW w:type="dxa" w:w="3000"/>
+            <w:tcBorders>
+              <w:top w:val="single" w:color="CCCCCC" w:sz="1"/>
+              <w:left w:val="single" w:color="CCCCCC" w:sz="1"/>
+              <w:bottom w:val="single" w:color="CCCCCC" w:sz="1"/>
+              <w:right w:val="single" w:color="CCCCCC" w:sz="1"/>
+            </w:tcBorders>
+            <w:shd w:fill="F2F5FA" w:val="clear"/>
+            <w:tcMar>
+              <w:top w:type="dxa" w:w="80"/>
+              <w:left w:type="dxa" w:w="120"/>
+              <w:bottom w:type="dxa" w:w="80"/>
+              <w:right w:type="dxa" w:w="120"/>
+            </w:tcMar>
+          </w:tcPr>
+          <w:p>
+            <w:r>
+              <w:t xml:space="preserve">Verbreed KPI-dashboard als wekelijks e-mailrapport, per factuurdatum-week</w:t>
+            </w:r>
+          </w:p>
+        </w:tc>
+        <w:tc>
+          <w:tcPr>
+            <w:tcW w:type="dxa" w:w="2960"/>
+            <w:tcBorders>
+              <w:top w:val="single" w:color="CCCCCC" w:sz="1"/>
+              <w:left w:val="single" w:color="CCCCCC" w:sz="1"/>
+              <w:bottom w:val="single" w:color="CCCCCC" w:sz="1"/>
+              <w:right w:val="single" w:color="CCCCCC" w:sz="1"/>
+            </w:tcBorders>
+            <w:shd w:fill="F2F5FA" w:val="clear"/>
+            <w:tcMar>
+              <w:top w:type="dxa" w:w="80"/>
+              <w:left w:type="dxa" w:w="120"/>
+              <w:bottom w:type="dxa" w:w="80"/>
+              <w:right w:type="dxa" w:w="120"/>
+            </w:tcMar>
+          </w:tcPr>
+          <w:p>
+            <w:r>
               <w:t xml:space="preserve">Huidige versie (e-mail)</w:t>
             </w:r>
           </w:p>
@@ -1995,12 +2183,133 @@
         <w:pStyle w:val="Heading2"/>
       </w:pPr>
       <w:r>
+        <w:t xml:space="preserve">Iteratie 9 — Volledig overzicht (alle data)</w:t>
+      </w:r>
+    </w:p>
+    <w:p>
+      <w:pPr>
+        <w:spacing w:before="80"/>
+      </w:pPr>
+      <w:r>
+        <w:rPr>
+          <w:b/>
+          <w:bCs/>
+        </w:rPr>
+        <w:t xml:space="preserve">Bestand. </w:t>
+      </w:r>
+      <w:r>
+        <w:t xml:space="preserve">v9_email_volledig.json</w:t>
+      </w:r>
+    </w:p>
+    <w:p>
+      <w:pPr>
+        <w:spacing w:before="80"/>
+      </w:pPr>
+      <w:r>
+        <w:rPr>
+          <w:b/>
+          <w:bCs/>
+        </w:rPr>
+        <w:t xml:space="preserve">Wat het is. </w:t>
+      </w:r>
+      <w:r>
+        <w:t xml:space="preserve">Dezelfde rijke KPI-opzet als het weekrapport, maar zonder weekfilter: het dashboard rekent over de volledige dataset en wordt handmatig verstuurd. Handig voor een totaaloverzicht of een ad-hoc controle los van het wekelijkse ritme.</w:t>
+      </w:r>
+    </w:p>
+    <w:p>
+      <w:pPr>
+        <w:spacing w:before="80"/>
+      </w:pPr>
+      <w:r>
+        <w:rPr>
+          <w:b/>
+          <w:bCs/>
+        </w:rPr>
+        <w:t xml:space="preserve">Waarom deze aanpak. </w:t>
+      </w:r>
+      <w:r>
+        <w:t xml:space="preserve">Naast het wekelijkse rapport bleek er behoefte aan een overzicht over alle verwerkte facturen tegelijk (bijvoorbeeld een periodieke totaalcontrole). De onderliggende KPI-berekening en opmaak zijn gelijk aan het weekrapport; alleen het tijdvenster en de trigger verschillen.</w:t>
+      </w:r>
+    </w:p>
+    <w:p>
+      <w:pPr>
+        <w:pStyle w:val="Heading2"/>
+      </w:pPr>
+      <w:r>
+        <w:t xml:space="preserve">Iteratie 10 — Weekrapport op de nieuwe databron</w:t>
+      </w:r>
+    </w:p>
+    <w:p>
+      <w:pPr>
+        <w:spacing w:before="80"/>
+      </w:pPr>
+      <w:r>
+        <w:rPr>
+          <w:b/>
+          <w:bCs/>
+        </w:rPr>
+        <w:t xml:space="preserve">Bestanden. </w:t>
+      </w:r>
+      <w:r>
+        <w:t xml:space="preserve">v10_email_weekrapport_nieuwe-koppeling.json (huidig) en v10_email_weekrapport_oude-koppeling.json (historische variant).</w:t>
+      </w:r>
+    </w:p>
+    <w:p>
+      <w:pPr>
+        <w:spacing w:before="80"/>
+      </w:pPr>
+      <w:r>
+        <w:rPr>
+          <w:b/>
+          <w:bCs/>
+        </w:rPr>
+        <w:t xml:space="preserve">Wat het is. </w:t>
+      </w:r>
+      <w:r>
+        <w:t xml:space="preserve">Het wekelijkse weekrapport, nu gekoppeld aan de nieuwe databron. De oude variant hing nog aan de oude Excel-koppeling en is bewaard als historisch bestand.</w:t>
+      </w:r>
+    </w:p>
+    <w:p>
+      <w:pPr>
+        <w:spacing w:before="80"/>
+      </w:pPr>
+      <w:r>
+        <w:rPr>
+          <w:b/>
+          <w:bCs/>
+        </w:rPr>
+        <w:t xml:space="preserve">Belangrijk. </w:t>
+      </w:r>
+      <w:r>
+        <w:t xml:space="preserve">De node-logica is in beide identiek — dezelfde KPI-berekening, dezelfde mail-veilige opmaak en dezelfde Google Sheets-bron. Het echte verschil zit in de data: de oude-koppeling-variant heeft 104 gepinde data-items (pinData) ingebakken, de oude dataset uit de oude Excel-koppeling. De nieuwe-koppeling-variant heeft geen gepinde data en leest live uit de nieuwe databron.</w:t>
+      </w:r>
+    </w:p>
+    <w:p>
+      <w:pPr>
+        <w:spacing w:before="80"/>
+      </w:pPr>
+      <w:r>
+        <w:rPr>
+          <w:b/>
+          <w:bCs/>
+        </w:rPr>
+        <w:t xml:space="preserve">Wat ik hiervan leerde. </w:t>
+      </w:r>
+      <w:r>
+        <w:t xml:space="preserve">Een versieverschil hoeft niet altijd in de code te zitten. Door de twee koppeling-varianten expliciet te benoemen blijft traceerbaar welke versie aan welke databron hing.</w:t>
+      </w:r>
+    </w:p>
+    <w:p>
+      <w:pPr>
+        <w:pStyle w:val="Heading2"/>
+      </w:pPr>
+      <w:r>
         <w:t xml:space="preserve">Conclusie en vervolg</w:t>
       </w:r>
     </w:p>
     <w:p>
       <w:r>
-        <w:t xml:space="preserve">De ontwikkeling laat een duidelijke lijn zien: van een open AI-agent (iteratie 1), via een te complex e-maildashboard (iteratie 2) en een eerste webpagina-poging (iteratie 3), naar een werkend dashboard zodra de juiste databron en veldnamen gevonden waren (iteratie 4-5), en ten slotte naar een dashboard dat de KPI's van de opdrachtgever toont (iteratie 6-7), en ten slotte naar een wekelijks weekrapport met verbrede KPI's (iteratie 8).</w:t>
+        <w:t xml:space="preserve">De ontwikkeling laat een duidelijke lijn zien: van een open AI-agent (iteratie 1), via een te complex e-maildashboard (iteratie 2) en een eerste webpagina-poging (iteratie 3), naar een werkend dashboard zodra de juiste databron en veldnamen gevonden waren (iteratie 4-5), en ten slotte naar een dashboard dat de KPI's van de opdrachtgever toont (iteratie 6-7), en ten slotte naar een wekelijks weekrapport met verbrede KPI's (iteratie 8), een volledig-overzichtvariant (iteratie 9), en ten slotte het weekrapport op de nieuwe databron (iteratie 10).</w:t>
       </w:r>
     </w:p>
     <w:p>
@@ -2010,7 +2319,7 @@
     </w:p>
     <w:p>
       <w:r>
-        <w:t xml:space="preserve">Het dashboard bestaat nu in twee gelijkwaardige vormen — de webpagina (v6_webhook_kpi.json) en het wekelijkse e-mailrapport (v8_email_weekrapport.json) — zodat de opdrachtgever kan kiezen welke het best past bij “makkelijk in gebruik” en “laagdrempelig”. Mijn volgende stap is het verfijnen van KPI 2: door ook het tabblad Factuurregels uit te lezen, kan de factuurkwaliteit op artikelniveau gemeten worden in plaats van op factuurniveau.</w:t>
+        <w:t xml:space="preserve">Het dashboard bestaat nu in twee gelijkwaardige vormen — de webpagina (v6_webhook_kpi.json) en het wekelijkse e-mailrapport op de nieuwe databron (v10_email_weekrapport_nieuwe-koppeling.json) — zodat de opdrachtgever kan kiezen welke het best past bij “makkelijk in gebruik” en “laagdrempelig”. Mijn volgende stap is het verfijnen van KPI 2: door ook het tabblad Factuurregels uit te lezen, kan de factuurkwaliteit op artikelniveau gemeten worden in plaats van op factuurniveau.</w:t>
       </w:r>
     </w:p>
     <w:sectPr>

</xml_diff>

<commit_message>
docs: README, BEOORDELAAR en versiedocumentatie.docx bijgewerkt naar v14/overdracht
- README.md: N8N-regel bijgewerkt van v1-v10 naar v1-v14
- BEOORDELAAR.md: datum, versienummers (v8→v14), PR-tabel uitgebreid met #9 en #10,
  huidige versie gewijzigd naar v11 overdrachtsversie (inhoudelijk v14)
- versiedocumentatie.docx: iteraties 11-14 toegevoegd + conclusie bijgewerkt
  (zelfde inhoud als versiedocumentatie.md)

Co-Authored-By: Claude Sonnet 4.6 <noreply@anthropic.com>
</commit_message>
<xml_diff>
--- a/n8n/dashboard/versiedocumentatie.docx
+++ b/n8n/dashboard/versiedocumentatie.docx
@@ -2304,22 +2304,158 @@
         <w:pStyle w:val="Heading2"/>
       </w:pPr>
       <w:r>
+        <w:t xml:space="preserve">Iteratie 11 — Severity-correctie in KPI 3</w:t>
+      </w:r>
+    </w:p>
+    <w:p>
+      <w:r>
+        <w:rPr>
+          <w:b/>
+          <w:bCs/>
+        </w:rPr>
+        <w:t xml:space="preserve">Bestand: </w:t>
+      </w:r>
+      <w:r>
+        <w:t xml:space="preserve">v11_control_tower_email_overdracht.json (bevat ook v12 t/m v14, zie toelichting).</w:t>
+      </w:r>
+    </w:p>
+    <w:p>
+      <w:r>
+        <w:t xml:space="preserve">In de “Bereken KPI’s”-node werd de zwaarste severity per foutcode niet altijd correct bijgehouden. Als een foutcode meerdere keren voorkwam met wisselende ernst (bijv. eerst REVIEW, dan FATAL), bleef de eerst aangetroffen severity staan. De foutTeller-logica is aangepast zodat bij een zwaarder type (FATAL vóór REVIEW vóór ONBEKEND) de severity wordt bijgewerkt — zodat een ernstige fout nooit per ongeluk als lichte fout verschijnt.</w:t>
+      </w:r>
+    </w:p>
+    <w:p>
+      <w:r>
+        <w:rPr>
+          <w:b/>
+          <w:bCs/>
+        </w:rPr>
+        <w:t xml:space="preserve">Waarom: </w:t>
+      </w:r>
+      <w:r>
+        <w:t xml:space="preserve">Een FATAL-fout die later in de rij staat, werd getoond als REVIEW als het eerste voorkomen REVIEW had. Dat geeft een misleidend beeld van de ernst.</w:t>
+      </w:r>
+    </w:p>
+    <w:p>
+      <w:pPr>
+        <w:pStyle w:val="Heading2"/>
+      </w:pPr>
+      <w:r>
+        <w:t xml:space="preserve">Iteratie 12 — Voetnoot bij afgekapte aandachtslijst</w:t>
+      </w:r>
+    </w:p>
+    <w:p>
+      <w:r>
+        <w:t xml:space="preserve">De aandachtslijst toont maximaal 10 facturen. Daarvoor werd de volledige lijst direct afgekapt, zonder te melden hoeveel er buiten beeld vielen. Nu wordt eerst de volledige gesorteerde lijst opgebouwd, vervolgens afgekapt tot 10, en het verschil (aandachtVerborgen) apart doorgegeven. Zodra er meer dan 10 aandachtsfacturen zijn, verschijnt automatisch een voetnoot.</w:t>
+      </w:r>
+    </w:p>
+    <w:p>
+      <w:r>
+        <w:rPr>
+          <w:b/>
+          <w:bCs/>
+        </w:rPr>
+        <w:t xml:space="preserve">Waarom: </w:t>
+      </w:r>
+      <w:r>
+        <w:t xml:space="preserve">Zonder die voetnoot kon de ontvanger ten onrechte denken dat het rapport volledig was, terwijl hogere-risico facturen buiten beeld vielen.</w:t>
+      </w:r>
+    </w:p>
+    <w:p>
+      <w:pPr>
+        <w:pStyle w:val="Heading2"/>
+      </w:pPr>
+      <w:r>
+        <w:t xml:space="preserve">Iteratie 13 — Lege week: KPI 1-balk verborgen, stpPct op null</w:t>
+      </w:r>
+    </w:p>
+    <w:p>
+      <w:r>
+        <w:t xml:space="preserve">Bij een week zonder facturen werd stpPct eerder berekend als 100% (0 van 0 facturen zijn handmatig). Dat verscheen als “100% automatisch · doel gehaald”, wat feitelijk onjuist is. Nu wordt stpPct bij een lege week expliciet op null gezet. De balk toont dan “Geen data beschikbaar voor deze periode” in plaats van een misleidende 100%-balk.</w:t>
+      </w:r>
+    </w:p>
+    <w:p>
+      <w:r>
+        <w:rPr>
+          <w:b/>
+          <w:bCs/>
+        </w:rPr>
+        <w:t xml:space="preserve">Waarom: </w:t>
+      </w:r>
+      <w:r>
+        <w:t xml:space="preserve">Een lege week is geen prestatie — ze mag er niet uitzien als een perfect resultaat.</w:t>
+      </w:r>
+    </w:p>
+    <w:p>
+      <w:pPr>
+        <w:pStyle w:val="Heading2"/>
+      </w:pPr>
+      <w:r>
+        <w:t xml:space="preserve">Iteratie 14 — Lege-weekmodus volledig + overdrachtsversie</w:t>
+      </w:r>
+    </w:p>
+    <w:p>
+      <w:r>
+        <w:rPr>
+          <w:b/>
+          <w:bCs/>
+        </w:rPr>
+        <w:t xml:space="preserve">Bestand: </w:t>
+      </w:r>
+      <w:r>
+        <w:t xml:space="preserve">v11_control_tower_email_overdracht.json</w:t>
+      </w:r>
+    </w:p>
+    <w:p>
+      <w:r>
+        <w:t xml:space="preserve">Bij een lege week werden eerder alle KPI-secties nog steeds opgebouwd (met nullen en € 0,00). Nu worden alle KPI-, risico- en tabelblokken volledig overgeslagen. Het rapport toont dan uitsluitend de kopregel, een nette grijze banner (“Geen facturen verwerkt”) en de voettekst. Daarnaast is het ontvangersadres gewijzigd naar het definitieve zakelijke adres indy@bajo-bouw.nl.</w:t>
+      </w:r>
+    </w:p>
+    <w:p>
+      <w:r>
+        <w:rPr>
+          <w:b/>
+          <w:bCs/>
+        </w:rPr>
+        <w:t xml:space="preserve">Naamgeving-opmerking: </w:t>
+      </w:r>
+      <w:r>
+        <w:t xml:space="preserve">Het workflowbestand is in n8n getagd als “v11”. Inhoudelijk omvat het de correcties van v11 t/m v14. Dat is een naamgevingskwestie, geen inhoudelijk probleem — de code is consistent en correct.</w:t>
+      </w:r>
+    </w:p>
+    <w:p>
+      <w:r>
+        <w:rPr>
+          <w:b/>
+          <w:bCs/>
+        </w:rPr>
+        <w:t xml:space="preserve">Openstaand actiepunt: </w:t>
+      </w:r>
+      <w:r>
+        <w:t xml:space="preserve">De Gmail-credential voor indy@bajo-bouw.nl moet nog worden aangemaakt in n8n. Pas daarna kan de workflow op “active” worden gezet.</w:t>
+      </w:r>
+    </w:p>
+    <w:p>
+      <w:pPr>
+        <w:pStyle w:val="Heading2"/>
+      </w:pPr>
+      <w:r>
         <w:t xml:space="preserve">Conclusie en vervolg</w:t>
       </w:r>
     </w:p>
     <w:p>
       <w:r>
-        <w:t xml:space="preserve">De ontwikkeling laat een duidelijke lijn zien: van een open AI-agent (iteratie 1), via een te complex e-maildashboard (iteratie 2) en een eerste webpagina-poging (iteratie 3), naar een werkend dashboard zodra de juiste databron en veldnamen gevonden waren (iteratie 4-5), en ten slotte naar een dashboard dat de KPI's van de opdrachtgever toont (iteratie 6-7), en ten slotte naar een wekelijks weekrapport met verbrede KPI's (iteratie 8), een volledig-overzichtvariant (iteratie 9), en ten slotte het weekrapport op de nieuwe databron (iteratie 10).</w:t>
-      </w:r>
-    </w:p>
-    <w:p>
-      <w:r>
-        <w:t xml:space="preserve">Twee dingen stuurden die ontwikkeling: de technische problemen met de databron en de dataverwerking, en de klantverwachtingen van de opdrachtgever. Het kantelpunt was de ontdekking dat de juiste databron de Google Sheets-log was, met exact overeenkomende veldnamen. Vanaf dat moment kon ik het dashboard niet alleen laten werken, maar ook uitbreiden met betekenisvolle KPI's.</w:t>
-      </w:r>
-    </w:p>
-    <w:p>
-      <w:r>
-        <w:t xml:space="preserve">Het dashboard bestaat nu in twee gelijkwaardige vormen — de webpagina (v6_webhook_kpi.json) en het wekelijkse e-mailrapport op de nieuwe databron (v10_email_weekrapport_nieuwe-koppeling.json) — zodat de opdrachtgever kan kiezen welke het best past bij “makkelijk in gebruik” en “laagdrempelig”. Mijn volgende stap is het verfijnen van KPI 2: door ook het tabblad Factuurregels uit te lezen, kan de factuurkwaliteit op artikelniveau gemeten worden in plaats van op factuurniveau.</w:t>
+        <w:t xml:space="preserve">De ontwikkeling laat een duidelijke lijn zien: van een open AI-agent (iteratie 1), via een te complex e-maildashboard (iteratie 2) en een eerste webpagina-poging (iteratie 3), naar een werkend dashboard zodra de juiste databron en veldnamen gevonden waren (iteratie 4-5), naar een dashboard dat de KPI’s van de opdrachtgever toont (iteratie 6-7), naar een wekelijks weekrapport met verbrede KPI’s (iteratie 8), een volledig-overzichtvariant (iteratie 9), het weekrapport op de nieuwe databron (iteratie 10), en ten slotte vier gerichte bugfixes (iteraties 11-14) die resulteren in de definitieve overdrachtsversie.</w:t>
+      </w:r>
+    </w:p>
+    <w:p>
+      <w:r>
+        <w:t xml:space="preserve">Twee dingen stuurden die ontwikkeling: de technische problemen met de databron en de dataverwerking, en de klantverwachtingen van de opdrachtgever. Het kantelpunt was de ontdekking dat de juiste databron de Google Sheets-log was, met exact overeenkomende veldnamen. Vanaf dat moment kon ik het dashboard niet alleen laten werken, maar ook uitbreiden met betekenisvolle KPI’s.</w:t>
+      </w:r>
+    </w:p>
+    <w:p>
+      <w:r>
+        <w:t xml:space="preserve">Het definitieve product is het wekelijkse e-mailrapport (v11_control_tower_email_overdracht.json, inhoudelijk v14) dat elke maandagochtend om 05:00 uur automatisch wordt verstuurd naar indy@bajo-bouw.nl. De webpagina-versie (v6_webhook_kpi.json) blijft beschikbaar als alternatieve weergave.</w:t>
       </w:r>
     </w:p>
     <w:sectPr>

</xml_diff>